<commit_message>
Documentacion v1.2 completa: docs/02, docs/03, diagramas y entregables
- docs/02 y docs/03 pasan a v1.2 (partiendo de la v1.1): compilacion para
  ESP32-C6, pilas AA Ni-MH, nodos sin microSD, LiFePO4 de cabina, Tenda N301.
- Diagramas 01, 02 y 05 redibujados con el hardware actual.
- docx y pdf de los tres capitulos regenerados.
- Textos de checksum/timeout en censo y contratos acordes al RCWL-1655.

Co-Authored-By: Claude Opus 5.5 <noreply@anthropic.com>
</commit_message>
<xml_diff>
--- a/docs/entregables/01-arquitectura-hardware.docx
+++ b/docs/entregables/01-arquitectura-hardware.docx
@@ -37,7 +37,7 @@
           <w:color w:val="0B0B0B"/>
           <w:sz w:val="21"/>
         </w:rPr>
-        <w:t xml:space="preserve"> Versión 1.0 — 21 de septiembre de 2026</w:t>
+        <w:t xml:space="preserve"> Versión 1.2 — 22 de octubre de 2026</w:t>
       </w:r>
     </w:p>
     <w:p>
@@ -101,6 +101,207 @@
     </w:p>
     <w:p>
       <w:pPr>
+        <w:spacing w:after="160"/>
+        <w:ind w:left="283"/>
+        <w:shd w:val="clear" w:color="auto" w:fill="EEF3FB"/>
+        <w:pBdr>
+          <w:left w:val="single" w:sz="18" w:space="8" w:color="1D4ED8"/>
+        </w:pBdr>
+      </w:pPr>
+      <w:r>
+        <w:rPr>
+          <w:b/>
+          <w:i w:val="0"/>
+          <w:color w:val="0B0B0B"/>
+          <w:sz w:val="20"/>
+        </w:rPr>
+        <w:t>Cambios de la versión 1.1.</w:t>
+      </w:r>
+      <w:r>
+        <w:rPr>
+          <w:b w:val="0"/>
+          <w:i w:val="0"/>
+          <w:color w:val="0B0B0B"/>
+          <w:sz w:val="20"/>
+        </w:rPr>
+        <w:t xml:space="preserve"> La central ya no se alimenta de la máquina: lleva su propio paquete de baterías, y con él desaparecen la señal de contacto y el apagado por llave (§3.5). La iluminación de la tolva pasa a ser pulsada y comparte paquete con </w:t>
+      </w:r>
+      <w:r>
+        <w:rPr>
+          <w:rFonts w:ascii="Consolas" w:hAnsi="Consolas"/>
+          <w:b w:val="0"/>
+          <w:i w:val="0"/>
+          <w:color w:val="8B2E2E"/>
+          <w:sz w:val="18"/>
+        </w:rPr>
+        <w:t>CAM04</w:t>
+      </w:r>
+      <w:r>
+        <w:rPr>
+          <w:b w:val="0"/>
+          <w:i w:val="0"/>
+          <w:color w:val="0B0B0B"/>
+          <w:sz w:val="20"/>
+        </w:rPr>
+        <w:t xml:space="preserve"> (§3.6). Se declara la limitación de la velocidad estimada por rueda (§5.3), se añade la validación pendiente de los ultrasónicos (§10) y se corrigen cifras de las §2.3 y §9.</w:t>
+      </w:r>
+    </w:p>
+    <w:p>
+      <w:pPr>
+        <w:spacing w:after="160"/>
+        <w:ind w:left="283"/>
+        <w:shd w:val="clear" w:color="auto" w:fill="EEF3FB"/>
+        <w:pBdr>
+          <w:left w:val="single" w:sz="18" w:space="8" w:color="1D4ED8"/>
+        </w:pBdr>
+      </w:pPr>
+      <w:r>
+        <w:rPr>
+          <w:b/>
+          <w:i w:val="0"/>
+          <w:color w:val="0B0B0B"/>
+          <w:sz w:val="20"/>
+        </w:rPr>
+        <w:t>Cambios de la versión 1.2 (hardware que llegó en octubre).</w:t>
+      </w:r>
+      <w:r>
+        <w:rPr>
+          <w:b w:val="0"/>
+          <w:i w:val="0"/>
+          <w:color w:val="0B0B0B"/>
+          <w:sz w:val="20"/>
+        </w:rPr>
+        <w:t xml:space="preserve"> Los nodos de sensor pasan a </w:t>
+      </w:r>
+      <w:r>
+        <w:rPr>
+          <w:b/>
+          <w:i w:val="0"/>
+          <w:color w:val="0B0B0B"/>
+          <w:sz w:val="20"/>
+        </w:rPr>
+        <w:t>ESP32-C6 DevKitC</w:t>
+      </w:r>
+      <w:r>
+        <w:rPr>
+          <w:b w:val="0"/>
+          <w:i w:val="0"/>
+          <w:color w:val="0B0B0B"/>
+          <w:sz w:val="20"/>
+        </w:rPr>
+        <w:t xml:space="preserve">; el ultrasónico es el </w:t>
+      </w:r>
+      <w:r>
+        <w:rPr>
+          <w:b/>
+          <w:i w:val="0"/>
+          <w:color w:val="0B0B0B"/>
+          <w:sz w:val="20"/>
+        </w:rPr>
+        <w:t>RCWL-1655</w:t>
+      </w:r>
+      <w:r>
+        <w:rPr>
+          <w:b w:val="0"/>
+          <w:i w:val="0"/>
+          <w:color w:val="0B0B0B"/>
+          <w:sz w:val="20"/>
+        </w:rPr>
+        <w:t xml:space="preserve"> en modo Trig/Echo, no el A02YYUW; el Hall es el módulo </w:t>
+      </w:r>
+      <w:r>
+        <w:rPr>
+          <w:b/>
+          <w:i w:val="0"/>
+          <w:color w:val="0B0B0B"/>
+          <w:sz w:val="20"/>
+        </w:rPr>
+        <w:t>HW-477</w:t>
+      </w:r>
+      <w:r>
+        <w:rPr>
+          <w:b w:val="0"/>
+          <w:i w:val="0"/>
+          <w:color w:val="0B0B0B"/>
+          <w:sz w:val="20"/>
+        </w:rPr>
+        <w:t xml:space="preserve"> (A3144). Los nodos se alimentan con </w:t>
+      </w:r>
+      <w:r>
+        <w:rPr>
+          <w:b/>
+          <w:i w:val="0"/>
+          <w:color w:val="0B0B0B"/>
+          <w:sz w:val="20"/>
+        </w:rPr>
+        <w:t>4 pilas AA Ni-MH</w:t>
+      </w:r>
+      <w:r>
+        <w:rPr>
+          <w:b w:val="0"/>
+          <w:i w:val="0"/>
+          <w:color w:val="0B0B0B"/>
+          <w:sz w:val="20"/>
+        </w:rPr>
+        <w:t xml:space="preserve"> en serie, directo al pin de 5 V, y </w:t>
+      </w:r>
+      <w:r>
+        <w:rPr>
+          <w:b/>
+          <w:i w:val="0"/>
+          <w:color w:val="0B0B0B"/>
+          <w:sz w:val="20"/>
+        </w:rPr>
+        <w:t>no llevan microSD</w:t>
+      </w:r>
+      <w:r>
+        <w:rPr>
+          <w:b w:val="0"/>
+          <w:i w:val="0"/>
+          <w:color w:val="0B0B0B"/>
+          <w:sz w:val="20"/>
+        </w:rPr>
+        <w:t xml:space="preserve">. La central se alimenta con una </w:t>
+      </w:r>
+      <w:r>
+        <w:rPr>
+          <w:b/>
+          <w:i w:val="0"/>
+          <w:color w:val="0B0B0B"/>
+          <w:sz w:val="20"/>
+        </w:rPr>
+        <w:t>batería LiFePO4 de 12 V y 12 Ah</w:t>
+      </w:r>
+      <w:r>
+        <w:rPr>
+          <w:b w:val="0"/>
+          <w:i w:val="0"/>
+          <w:color w:val="0B0B0B"/>
+          <w:sz w:val="20"/>
+        </w:rPr>
+        <w:t xml:space="preserve">, y el punto de acceso es un </w:t>
+      </w:r>
+      <w:r>
+        <w:rPr>
+          <w:b/>
+          <w:i w:val="0"/>
+          <w:color w:val="0B0B0B"/>
+          <w:sz w:val="20"/>
+        </w:rPr>
+        <w:t>router Tenda N301</w:t>
+      </w:r>
+      <w:r>
+        <w:rPr>
+          <w:b w:val="0"/>
+          <w:i w:val="0"/>
+          <w:color w:val="0B0B0B"/>
+          <w:sz w:val="20"/>
+        </w:rPr>
+        <w:t xml:space="preserve"> a 9 V. El LED de la tolva es un módulo de inyección de 12 V con su propia batería de 9 V (§2, §3, §4.2, §5, §9, §10, §11).</w:t>
+      </w:r>
+    </w:p>
+    <w:p>
+      <w:pPr>
         <w:spacing w:before="120" w:after="120"/>
         <w:pBdr>
           <w:bottom w:val="single" w:sz="4" w:space="1" w:color="D6D5D0"/>
@@ -133,7 +334,7 @@
           <w:color w:val="0B0B0B"/>
           <w:sz w:val="21"/>
         </w:rPr>
-        <w:t>RiceVi observa la operación de corte de una cosechadora de arroz con cuatro cámaras y cuatro sensores, guarda esa observación de forma trazable, y —cuando existan modelos entrenados— la analiza a bordo para dar retroalimentación al operario.</w:t>
+        <w:t>RiceVi observa la operación de una cosechadora de arroz —el corte y lo que llega a la tolva— con cuatro cámaras y cuatro sensores, guarda esa observación de forma trazable, y —cuando existan modelos entrenados— la analiza a bordo para dar retroalimentación al operario.</w:t>
       </w:r>
     </w:p>
     <w:p>
@@ -165,6 +366,71 @@
         <w:t>. El operario decide si modifica la máquina; el sistema no acciona nada.</w:t>
       </w:r>
     </w:p>
+    <w:p>
+      <w:r>
+        <w:rPr>
+          <w:b w:val="0"/>
+          <w:i w:val="0"/>
+          <w:color w:val="0B0B0B"/>
+          <w:sz w:val="21"/>
+        </w:rPr>
+        <w:t xml:space="preserve">Como el sistema observa la operación tal como ocurre, sin provocar condiciones a propósito, las sugerencias tienen tres límites que conviene fijar desde ahora: salen de </w:t>
+      </w:r>
+      <w:r>
+        <w:rPr>
+          <w:b/>
+          <w:i w:val="0"/>
+          <w:color w:val="0B0B0B"/>
+          <w:sz w:val="21"/>
+        </w:rPr>
+        <w:t>reglas documentadas</w:t>
+      </w:r>
+      <w:r>
+        <w:rPr>
+          <w:b w:val="0"/>
+          <w:i w:val="0"/>
+          <w:color w:val="0B0B0B"/>
+          <w:sz w:val="21"/>
+        </w:rPr>
+        <w:t xml:space="preserve"> —el manual de la máquina o la literatura—, no de patrones hallados en los propios datos; son </w:t>
+      </w:r>
+      <w:r>
+        <w:rPr>
+          <w:b/>
+          <w:i w:val="0"/>
+          <w:color w:val="0B0B0B"/>
+          <w:sz w:val="21"/>
+        </w:rPr>
+        <w:t>cualitativas</w:t>
+      </w:r>
+      <w:r>
+        <w:rPr>
+          <w:b w:val="0"/>
+          <w:i w:val="0"/>
+          <w:color w:val="0B0B0B"/>
+          <w:sz w:val="21"/>
+        </w:rPr>
+        <w:t xml:space="preserve"> («considere subir la velocidad del molinete»), no valores objetivo; y </w:t>
+      </w:r>
+      <w:r>
+        <w:rPr>
+          <w:b/>
+          <w:i w:val="0"/>
+          <w:color w:val="0B0B0B"/>
+          <w:sz w:val="21"/>
+        </w:rPr>
+        <w:t>no se afirma</w:t>
+      </w:r>
+      <w:r>
+        <w:rPr>
+          <w:b w:val="0"/>
+          <w:i w:val="0"/>
+          <w:color w:val="0B0B0B"/>
+          <w:sz w:val="21"/>
+        </w:rPr>
+        <w:t xml:space="preserve"> que seguirlas reduzca las pérdidas, porque eso exigiría un experimento controlado.</w:t>
+      </w:r>
+    </w:p>
     <w:tbl>
       <w:tblPr>
         <w:tblStyle w:val="TableGrid"/>
@@ -504,6 +770,17 @@
       <w:pPr>
         <w:spacing w:after="80"/>
       </w:pPr>
+    </w:p>
+    <w:p>
+      <w:r>
+        <w:rPr>
+          <w:b w:val="0"/>
+          <w:i w:val="0"/>
+          <w:color w:val="0B0B0B"/>
+          <w:sz w:val="21"/>
+        </w:rPr>
+        <w:t>La trilla queda fuera del alcance actual. Si más adelante sobra tiempo, podría añadirse etiquetando grano partido sobre las mismas fotos de la tolva, sin volver a campo: por eso conviene capturarlas con calidad suficiente desde el principio.</w:t>
+      </w:r>
     </w:p>
     <w:p>
       <w:pPr>
@@ -1090,7 +1367,7 @@
                 <w:color w:val="0B0B0B"/>
                 <w:sz w:val="18"/>
               </w:rPr>
-              <w:t>Raspberry Pi 5, 8 GB + SSD NVMe 512 GB</w:t>
+              <w:t>Raspberry Pi 5, 8 GB + SSD NVMe 128 GB</w:t>
             </w:r>
           </w:p>
         </w:tc>
@@ -1173,7 +1450,7 @@
                 <w:color w:val="0B0B0B"/>
                 <w:sz w:val="18"/>
               </w:rPr>
-              <w:t>ESP32-S3-CAM con OV3660</w:t>
+              <w:t>GOOUUU ESP32-S3-CAM (N16R8) con OV3660</w:t>
             </w:r>
           </w:p>
         </w:tc>
@@ -1256,7 +1533,7 @@
                 <w:color w:val="0B0B0B"/>
                 <w:sz w:val="18"/>
               </w:rPr>
-              <w:t>ESP32-S3-CAM con OV3660</w:t>
+              <w:t>GOOUUU ESP32-S3-CAM (N16R8) con OV3660</w:t>
             </w:r>
           </w:p>
         </w:tc>
@@ -1339,7 +1616,7 @@
                 <w:color w:val="0B0B0B"/>
                 <w:sz w:val="18"/>
               </w:rPr>
-              <w:t>ESP32-S3-CAM con OV3660</w:t>
+              <w:t>GOOUUU ESP32-S3-CAM (N16R8) con OV3660</w:t>
             </w:r>
           </w:p>
         </w:tc>
@@ -1422,7 +1699,7 @@
                 <w:color w:val="0B0B0B"/>
                 <w:sz w:val="18"/>
               </w:rPr>
-              <w:t>ESP32-S3-CAM con OV3660</w:t>
+              <w:t>GOOUUU ESP32-S3-CAM (N16R8) con OV3660 + LED pulsado</w:t>
             </w:r>
           </w:p>
         </w:tc>
@@ -1505,7 +1782,7 @@
                 <w:color w:val="0B0B0B"/>
                 <w:sz w:val="18"/>
               </w:rPr>
-              <w:t>ESP32-S3 + sensor Hall</w:t>
+              <w:t>ESP32-C6 DevKitC + Hall HW-477 (A3144)</w:t>
             </w:r>
           </w:p>
         </w:tc>
@@ -1588,7 +1865,7 @@
                 <w:color w:val="0B0B0B"/>
                 <w:sz w:val="18"/>
               </w:rPr>
-              <w:t>ESP32-S3 + sensor Hall</w:t>
+              <w:t>ESP32-C6 DevKitC + Hall HW-477 (A3144)</w:t>
             </w:r>
           </w:p>
         </w:tc>
@@ -1671,7 +1948,7 @@
                 <w:color w:val="0B0B0B"/>
                 <w:sz w:val="18"/>
               </w:rPr>
-              <w:t>ESP32-S3 + A02YYUW</w:t>
+              <w:t>ESP32-C6 DevKitC + RCWL-1655</w:t>
             </w:r>
           </w:p>
         </w:tc>
@@ -1754,7 +2031,7 @@
                 <w:color w:val="0B0B0B"/>
                 <w:sz w:val="18"/>
               </w:rPr>
-              <w:t>ESP32-S3 + A02YYUW</w:t>
+              <w:t>ESP32-C6 DevKitC + RCWL-1655</w:t>
             </w:r>
           </w:p>
         </w:tc>
@@ -1832,7 +2109,7 @@
           <w:color w:val="0B0B0B"/>
           <w:sz w:val="21"/>
         </w:rPr>
-        <w:t xml:space="preserve">, el punto de acceso Wi-Fi de 2,4 GHz, y </w:t>
+        <w:t xml:space="preserve">, el punto de acceso Wi-Fi de 2,4 GHz (un router Tenda N301), y </w:t>
       </w:r>
       <w:r>
         <w:rPr>
@@ -1871,8 +2148,358 @@
           <w:color w:val="0B0B0B"/>
           <w:sz w:val="21"/>
         </w:rPr>
-        <w:t xml:space="preserve"> Cada sensor y cada cámara tiene su propio ESP32-S3 junto a él.</w:t>
+        <w:t xml:space="preserve"> Cada sensor y cada cámara tiene su propio ESP32 junto a él: ESP32-S3 en las cámaras, porque necesitan la PSRAM para el JPEG, y ESP32-C6 en los sensores. El firmware es el mismo para las dos familias; los pines cambian con </w:t>
       </w:r>
+      <w:r>
+        <w:rPr>
+          <w:rFonts w:ascii="Consolas" w:hAnsi="Consolas"/>
+          <w:b w:val="0"/>
+          <w:i w:val="0"/>
+          <w:color w:val="8B2E2E"/>
+          <w:sz w:val="19"/>
+        </w:rPr>
+        <w:t>CONFIG_IDF_TARGET_ESP32C6</w:t>
+      </w:r>
+      <w:r>
+        <w:rPr>
+          <w:b w:val="0"/>
+          <w:i w:val="0"/>
+          <w:color w:val="0B0B0B"/>
+          <w:sz w:val="21"/>
+        </w:rPr>
+        <w:t>.</w:t>
+      </w:r>
+    </w:p>
+    <w:tbl>
+      <w:tblPr>
+        <w:tblStyle w:val="TableGrid"/>
+        <w:tblW w:type="auto" w:w="0"/>
+        <w:jc w:val="center"/>
+        <w:tblLook w:firstColumn="1" w:firstRow="1" w:lastColumn="0" w:lastRow="0" w:noHBand="0" w:noVBand="1" w:val="04A0"/>
+      </w:tblPr>
+      <w:tblGrid>
+        <w:gridCol w:w="3213"/>
+        <w:gridCol w:w="3213"/>
+        <w:gridCol w:w="3213"/>
+      </w:tblGrid>
+      <w:tr>
+        <w:tc>
+          <w:tcPr>
+            <w:tcW w:type="dxa" w:w="3213"/>
+            <w:shd w:val="clear" w:color="auto" w:fill="E8EDF6"/>
+          </w:tcPr>
+          <w:p>
+            <w:pPr>
+              <w:spacing w:after="40" w:before="40"/>
+            </w:pPr>
+            <w:r/>
+            <w:r>
+              <w:rPr>
+                <w:b/>
+                <w:i w:val="0"/>
+                <w:color w:val="0B0B0B"/>
+                <w:sz w:val="18"/>
+              </w:rPr>
+              <w:t>Nodo</w:t>
+            </w:r>
+          </w:p>
+        </w:tc>
+        <w:tc>
+          <w:tcPr>
+            <w:tcW w:type="dxa" w:w="3213"/>
+            <w:shd w:val="clear" w:color="auto" w:fill="E8EDF6"/>
+          </w:tcPr>
+          <w:p>
+            <w:pPr>
+              <w:spacing w:after="40" w:before="40"/>
+            </w:pPr>
+            <w:r/>
+            <w:r>
+              <w:rPr>
+                <w:b/>
+                <w:i w:val="0"/>
+                <w:color w:val="0B0B0B"/>
+                <w:sz w:val="18"/>
+              </w:rPr>
+              <w:t>Señal</w:t>
+            </w:r>
+          </w:p>
+        </w:tc>
+        <w:tc>
+          <w:tcPr>
+            <w:tcW w:type="dxa" w:w="3213"/>
+            <w:shd w:val="clear" w:color="auto" w:fill="E8EDF6"/>
+          </w:tcPr>
+          <w:p>
+            <w:pPr>
+              <w:spacing w:after="40" w:before="40"/>
+            </w:pPr>
+            <w:r/>
+            <w:r>
+              <w:rPr>
+                <w:b/>
+                <w:i w:val="0"/>
+                <w:color w:val="0B0B0B"/>
+                <w:sz w:val="18"/>
+              </w:rPr>
+              <w:t>Pines de la ESP32-C6</w:t>
+            </w:r>
+          </w:p>
+        </w:tc>
+      </w:tr>
+      <w:tr>
+        <w:tc>
+          <w:tcPr>
+            <w:tcW w:type="dxa" w:w="3213"/>
+          </w:tcPr>
+          <w:p>
+            <w:pPr>
+              <w:spacing w:after="40" w:before="40"/>
+            </w:pPr>
+            <w:r/>
+            <w:r>
+              <w:rPr>
+                <w:b w:val="0"/>
+                <w:i w:val="0"/>
+                <w:color w:val="0B0B0B"/>
+                <w:sz w:val="18"/>
+              </w:rPr>
+              <w:t>Hall</w:t>
+            </w:r>
+          </w:p>
+        </w:tc>
+        <w:tc>
+          <w:tcPr>
+            <w:tcW w:type="dxa" w:w="3213"/>
+          </w:tcPr>
+          <w:p>
+            <w:pPr>
+              <w:spacing w:after="40" w:before="40"/>
+            </w:pPr>
+            <w:r/>
+            <w:r>
+              <w:rPr>
+                <w:b w:val="0"/>
+                <w:i w:val="0"/>
+                <w:color w:val="0B0B0B"/>
+                <w:sz w:val="18"/>
+              </w:rPr>
+              <w:t>Salida del A3144 por un diodo 1N5819, con pull-up de 10 kΩ a 3,3 V y 100 nF a GND; el módulo se alimenta a 5 V</w:t>
+            </w:r>
+          </w:p>
+        </w:tc>
+        <w:tc>
+          <w:tcPr>
+            <w:tcW w:type="dxa" w:w="3213"/>
+          </w:tcPr>
+          <w:p>
+            <w:pPr>
+              <w:spacing w:after="40" w:before="40"/>
+            </w:pPr>
+            <w:r/>
+            <w:r>
+              <w:rPr>
+                <w:b w:val="0"/>
+                <w:i w:val="0"/>
+                <w:color w:val="0B0B0B"/>
+                <w:sz w:val="18"/>
+              </w:rPr>
+              <w:t>GPIO10</w:t>
+            </w:r>
+          </w:p>
+        </w:tc>
+      </w:tr>
+      <w:tr>
+        <w:tc>
+          <w:tcPr>
+            <w:tcW w:type="dxa" w:w="3213"/>
+          </w:tcPr>
+          <w:p>
+            <w:pPr>
+              <w:spacing w:after="40" w:before="40"/>
+            </w:pPr>
+            <w:r/>
+            <w:r>
+              <w:rPr>
+                <w:b w:val="0"/>
+                <w:i w:val="0"/>
+                <w:color w:val="0B0B0B"/>
+                <w:sz w:val="18"/>
+              </w:rPr>
+              <w:t>Ultrasónico</w:t>
+            </w:r>
+          </w:p>
+        </w:tc>
+        <w:tc>
+          <w:tcPr>
+            <w:tcW w:type="dxa" w:w="3213"/>
+          </w:tcPr>
+          <w:p>
+            <w:pPr>
+              <w:spacing w:after="40" w:before="40"/>
+            </w:pPr>
+            <w:r/>
+            <w:r>
+              <w:rPr>
+                <w:b w:val="0"/>
+                <w:i w:val="0"/>
+                <w:color w:val="0B0B0B"/>
+                <w:sz w:val="18"/>
+              </w:rPr>
+              <w:t>RCWL-1655 alimentado a 3,3 V, sin R7 (modo GPIO)</w:t>
+            </w:r>
+          </w:p>
+        </w:tc>
+        <w:tc>
+          <w:tcPr>
+            <w:tcW w:type="dxa" w:w="3213"/>
+          </w:tcPr>
+          <w:p>
+            <w:pPr>
+              <w:spacing w:after="40" w:before="40"/>
+            </w:pPr>
+            <w:r/>
+            <w:r>
+              <w:rPr>
+                <w:b w:val="0"/>
+                <w:i w:val="0"/>
+                <w:color w:val="0B0B0B"/>
+                <w:sz w:val="18"/>
+              </w:rPr>
+              <w:t>Trig GPIO11 · Echo GPIO10</w:t>
+            </w:r>
+          </w:p>
+        </w:tc>
+      </w:tr>
+      <w:tr>
+        <w:tc>
+          <w:tcPr>
+            <w:tcW w:type="dxa" w:w="3213"/>
+          </w:tcPr>
+          <w:p>
+            <w:pPr>
+              <w:spacing w:after="40" w:before="40"/>
+            </w:pPr>
+            <w:r/>
+            <w:r>
+              <w:rPr>
+                <w:b w:val="0"/>
+                <w:i w:val="0"/>
+                <w:color w:val="0B0B0B"/>
+                <w:sz w:val="18"/>
+              </w:rPr>
+              <w:t>Batería</w:t>
+            </w:r>
+          </w:p>
+        </w:tc>
+        <w:tc>
+          <w:tcPr>
+            <w:tcW w:type="dxa" w:w="3213"/>
+          </w:tcPr>
+          <w:p>
+            <w:pPr>
+              <w:spacing w:after="40" w:before="40"/>
+            </w:pPr>
+            <w:r/>
+            <w:r>
+              <w:rPr>
+                <w:b w:val="0"/>
+                <w:i w:val="0"/>
+                <w:color w:val="0B0B0B"/>
+                <w:sz w:val="18"/>
+              </w:rPr>
+              <w:t>Divisor 150 kΩ / 100 kΩ (todavía sin montar)</w:t>
+            </w:r>
+          </w:p>
+        </w:tc>
+        <w:tc>
+          <w:tcPr>
+            <w:tcW w:type="dxa" w:w="3213"/>
+          </w:tcPr>
+          <w:p>
+            <w:pPr>
+              <w:spacing w:after="40" w:before="40"/>
+            </w:pPr>
+            <w:r/>
+            <w:r>
+              <w:rPr>
+                <w:b w:val="0"/>
+                <w:i w:val="0"/>
+                <w:color w:val="0B0B0B"/>
+                <w:sz w:val="18"/>
+              </w:rPr>
+              <w:t>GPIO1</w:t>
+            </w:r>
+          </w:p>
+        </w:tc>
+      </w:tr>
+      <w:tr>
+        <w:tc>
+          <w:tcPr>
+            <w:tcW w:type="dxa" w:w="3213"/>
+          </w:tcPr>
+          <w:p>
+            <w:pPr>
+              <w:spacing w:after="40" w:before="40"/>
+            </w:pPr>
+            <w:r/>
+            <w:r>
+              <w:rPr>
+                <w:b w:val="0"/>
+                <w:i w:val="0"/>
+                <w:color w:val="0B0B0B"/>
+                <w:sz w:val="18"/>
+              </w:rPr>
+              <w:t>LED RGB de estado</w:t>
+            </w:r>
+          </w:p>
+        </w:tc>
+        <w:tc>
+          <w:tcPr>
+            <w:tcW w:type="dxa" w:w="3213"/>
+          </w:tcPr>
+          <w:p>
+            <w:pPr>
+              <w:spacing w:after="40" w:before="40"/>
+            </w:pPr>
+            <w:r/>
+            <w:r>
+              <w:rPr>
+                <w:b w:val="0"/>
+                <w:i w:val="0"/>
+                <w:color w:val="0B0B0B"/>
+                <w:sz w:val="18"/>
+              </w:rPr>
+              <w:t>El de la placa</w:t>
+            </w:r>
+          </w:p>
+        </w:tc>
+        <w:tc>
+          <w:tcPr>
+            <w:tcW w:type="dxa" w:w="3213"/>
+          </w:tcPr>
+          <w:p>
+            <w:pPr>
+              <w:spacing w:after="40" w:before="40"/>
+            </w:pPr>
+            <w:r/>
+            <w:r>
+              <w:rPr>
+                <w:b w:val="0"/>
+                <w:i w:val="0"/>
+                <w:color w:val="0B0B0B"/>
+                <w:sz w:val="18"/>
+              </w:rPr>
+              <w:t>GPIO8</w:t>
+            </w:r>
+          </w:p>
+        </w:tc>
+      </w:tr>
+    </w:tbl>
+    <w:p>
+      <w:pPr>
+        <w:spacing w:after="80"/>
+      </w:pPr>
     </w:p>
     <w:p>
       <w:pPr>
@@ -1981,7 +2608,7 @@
                 <w:color w:val="0B0B0B"/>
                 <w:sz w:val="18"/>
               </w:rPr>
-              <w:t>Cada sensor queda a centímetros de su microcontrolador. Desaparecen las tiradas largas de UART y de pulsos por el chasis</w:t>
+              <w:t>Cada sensor queda a centímetros de su microcontrolador. Desaparecen las tiradas largas de pulsos y de eco por el chasis</w:t>
             </w:r>
           </w:p>
         </w:tc>
@@ -2107,7 +2734,7 @@
                 <w:color w:val="0B0B0B"/>
                 <w:sz w:val="18"/>
               </w:rPr>
-              <w:t>Cada nodo hace una cosa. El conteo de pulsos no comparte CPU con la UART del ultrasónico</w:t>
+              <w:t>Cada nodo hace una cosa. El conteo de pulsos no comparte CPU con la medida de eco del ultrasónico</w:t>
             </w:r>
           </w:p>
         </w:tc>
@@ -2320,7 +2947,7 @@
                 <w:color w:val="0B0B0B"/>
                 <w:sz w:val="18"/>
               </w:rPr>
-              <w:t>SSD NVMe 512 GB por PCIe</w:t>
+              <w:t>SSD NVMe por PCIe en un HAT M.2; hoy de 128 GB, y la Pi arranca desde él</w:t>
             </w:r>
           </w:p>
         </w:tc>
@@ -2607,7 +3234,7 @@
                 <w:color w:val="0B0B0B"/>
                 <w:sz w:val="18"/>
               </w:rPr>
-              <w:t>Decisión del proyecto. La sección 8.3 documenta qué haría falta si luego se añade</w:t>
+              <w:t>Decisión del proyecto. La sección 7.3 explica el presupuesto de CPU y el escalonado térmico que lo hace viable</w:t>
             </w:r>
           </w:p>
         </w:tc>
@@ -2635,7 +3262,44 @@
           <w:color w:val="0B0B0B"/>
           <w:sz w:val="21"/>
         </w:rPr>
-        <w:t xml:space="preserve"> A 1 imagen/s por cámara, una jornada de ocho horas son 115.200 fotografías y unos 17 GB. Con 512 GB caben unas tres jornadas, que es el margen para no tener que descargar cada noche sin falta.</w:t>
+        <w:t xml:space="preserve"> A 1 imagen/s por cámara, una jornada de ocho horas serían 115.200 fotografías y unos 17 GB; con </w:t>
+      </w:r>
+      <w:r>
+        <w:rPr>
+          <w:rFonts w:ascii="Consolas" w:hAnsi="Consolas"/>
+          <w:b w:val="0"/>
+          <w:i w:val="0"/>
+          <w:color w:val="8B2E2E"/>
+          <w:sz w:val="19"/>
+        </w:rPr>
+        <w:t>CAM04</w:t>
+      </w:r>
+      <w:r>
+        <w:rPr>
+          <w:b w:val="0"/>
+          <w:i w:val="0"/>
+          <w:color w:val="0B0B0B"/>
+          <w:sz w:val="21"/>
+        </w:rPr>
+        <w:t xml:space="preserve"> a 0,5 img/s, como fija el plan, son unas 100.800 y unos 15 GB. </w:t>
+      </w:r>
+      <w:r>
+        <w:rPr>
+          <w:b/>
+          <w:i w:val="0"/>
+          <w:color w:val="0B0B0B"/>
+          <w:sz w:val="21"/>
+        </w:rPr>
+        <w:t>Con el SSD de 128 GB montado hoy</w:t>
+      </w:r>
+      <w:r>
+        <w:rPr>
+          <w:b w:val="0"/>
+          <w:i w:val="0"/>
+          <w:color w:val="0B0B0B"/>
+          <w:sz w:val="21"/>
+        </w:rPr>
+        <w:t xml:space="preserve"> (≈ 119 GB útiles, compartidos con el sistema) caben unas seis o siete jornadas: hay que descargar y verificar el respaldo cada pocos días. Con 512 GB serían del orden de treinta.</w:t>
       </w:r>
     </w:p>
     <w:p>
@@ -2667,21 +3331,12 @@
     <w:p>
       <w:r>
         <w:rPr>
-          <w:b w:val="0"/>
-          <w:i w:val="0"/>
-          <w:color w:val="0B0B0B"/>
-          <w:sz w:val="21"/>
-        </w:rPr>
-        <w:t xml:space="preserve">Dos sistemas independientes, y es deliberado: </w:t>
-      </w:r>
-      <w:r>
-        <w:rPr>
           <w:b/>
           <w:i w:val="0"/>
           <w:color w:val="0B0B0B"/>
           <w:sz w:val="21"/>
         </w:rPr>
-        <w:t>la central va alimentada de la máquina y cada nodo lleva su propia batería</w:t>
+        <w:t>Nada se conecta a la instalación eléctrica de la cosechadora.</w:t>
       </w:r>
       <w:r>
         <w:rPr>
@@ -2690,7 +3345,7 @@
           <w:color w:val="0B0B0B"/>
           <w:sz w:val="21"/>
         </w:rPr>
-        <w:t>. Así, un fallo en la instalación eléctrica de la cosechadora no apaga los ocho nodos a la vez, y montar un nodo no exige tirar cable hasta él.</w:t>
+        <w:t xml:space="preserve"> La central lleva su propio paquete de baterías y cada nodo lleva el suyo. Así no hay que intervenir el cableado de una máquina ajena —que es, además, la parte del montaje que más permisos exige—, un fallo eléctrico de la cosechadora no afecta al sistema, y montar un nodo no obliga a tirar cable hasta él.</w:t>
       </w:r>
     </w:p>
     <w:p>
@@ -2705,7 +3360,7 @@
           <w:color w:val="0B0B0B"/>
           <w:sz w:val="25"/>
         </w:rPr>
-        <w:t>3.1 Los nodos: paquete de dos celdas 18650</w:t>
+        <w:t>3.1 Los nodos: cuatro pilas AA Ni-MH en serie</w:t>
       </w:r>
     </w:p>
     <w:p>
@@ -2715,7 +3370,7 @@
       <w:r>
         <w:drawing>
           <wp:inline xmlns:a="http://schemas.openxmlformats.org/drawingml/2006/main" xmlns:pic="http://schemas.openxmlformats.org/drawingml/2006/picture">
-            <wp:extent cx="6120000" cy="843061"/>
+            <wp:extent cx="6120000" cy="1022602"/>
             <wp:docPr id="2" name="Picture 2"/>
             <wp:cNvGraphicFramePr>
               <a:graphicFrameLocks noChangeAspect="1"/>
@@ -2736,7 +3391,7 @@
                   <pic:spPr>
                     <a:xfrm>
                       <a:off x="0" y="0"/>
-                      <a:ext cx="6120000" cy="843061"/>
+                      <a:ext cx="6120000" cy="1022602"/>
                     </a:xfrm>
                     <a:prstGeom prst="rect"/>
                   </pic:spPr>
@@ -2832,7 +3487,7 @@
                 <w:color w:val="0B0B0B"/>
                 <w:sz w:val="18"/>
               </w:rPr>
-              <w:t>Celdas</w:t>
+              <w:t>Pilas</w:t>
             </w:r>
           </w:p>
         </w:tc>
@@ -2852,7 +3507,7 @@
                 <w:color w:val="0B0B0B"/>
                 <w:sz w:val="18"/>
               </w:rPr>
-              <w:t xml:space="preserve">2 × 18650 de 3000 mAh, </w:t>
+              <w:t xml:space="preserve">4 × AA Ni-MH </w:t>
             </w:r>
             <w:r>
               <w:rPr>
@@ -2861,16 +3516,34 @@
                 <w:color w:val="0B0B0B"/>
                 <w:sz w:val="18"/>
               </w:rPr>
-              <w:t>en paralelo</w:t>
-            </w:r>
-            <w:r>
-              <w:rPr>
-                <w:b w:val="0"/>
-                <w:i w:val="0"/>
-                <w:color w:val="0B0B0B"/>
-                <w:sz w:val="18"/>
-              </w:rPr>
-              <w:t xml:space="preserve"> (2P1S)</w:t>
+              <w:t>en serie</w:t>
+            </w:r>
+            <w:r>
+              <w:rPr>
+                <w:b w:val="0"/>
+                <w:i w:val="0"/>
+                <w:color w:val="0B0B0B"/>
+                <w:sz w:val="18"/>
+              </w:rPr>
+              <w:t xml:space="preserve"> (4S). La caja dice 3600 mAh; un AA Ni-MH real no pasa de unos 2800, así que se calcula con </w:t>
+            </w:r>
+            <w:r>
+              <w:rPr>
+                <w:b/>
+                <w:i w:val="0"/>
+                <w:color w:val="0B0B0B"/>
+                <w:sz w:val="18"/>
+              </w:rPr>
+              <w:t>2600 mAh</w:t>
+            </w:r>
+            <w:r>
+              <w:rPr>
+                <w:b w:val="0"/>
+                <w:i w:val="0"/>
+                <w:color w:val="0B0B0B"/>
+                <w:sz w:val="18"/>
+              </w:rPr>
+              <w:t xml:space="preserve"> hasta medir un juego</w:t>
             </w:r>
           </w:p>
         </w:tc>
@@ -2892,7 +3565,7 @@
                 <w:color w:val="0B0B0B"/>
                 <w:sz w:val="18"/>
               </w:rPr>
-              <w:t>Capacidad del paquete</w:t>
+              <w:t>Tensión</w:t>
             </w:r>
           </w:p>
         </w:tc>
@@ -2912,7 +3585,7 @@
                 <w:color w:val="0B0B0B"/>
                 <w:sz w:val="18"/>
               </w:rPr>
-              <w:t>6000 mAh a 3,7 V nominales ≈ 22,2 Wh</w:t>
+              <w:t>4,8 V nominales; 5,6 V recién cargadas; corte a 4,0 V (1,0 V por pila)</w:t>
             </w:r>
           </w:p>
         </w:tc>
@@ -2954,7 +3627,7 @@
                 <w:color w:val="0B0B0B"/>
                 <w:sz w:val="18"/>
               </w:rPr>
-              <w:t>≈ 18,9 Wh (85 % aprovechable hasta el corte)</w:t>
+              <w:t>≈ 10,6 Wh</w:t>
             </w:r>
           </w:p>
         </w:tc>
@@ -2976,7 +3649,7 @@
                 <w:color w:val="0B0B0B"/>
                 <w:sz w:val="18"/>
               </w:rPr>
-              <w:t>Protección</w:t>
+              <w:t>Conversión</w:t>
             </w:r>
           </w:p>
         </w:tc>
@@ -2991,12 +3664,21 @@
             <w:r/>
             <w:r>
               <w:rPr>
-                <w:b w:val="0"/>
-                <w:i w:val="0"/>
-                <w:color w:val="0B0B0B"/>
-                <w:sz w:val="18"/>
-              </w:rPr>
-              <w:t>Placa 1S con corte por descarga profunda a 3,0 V</w:t>
+                <w:b/>
+                <w:i w:val="0"/>
+                <w:color w:val="0B0B0B"/>
+                <w:sz w:val="18"/>
+              </w:rPr>
+              <w:t>Ninguna.</w:t>
+            </w:r>
+            <w:r>
+              <w:rPr>
+                <w:b w:val="0"/>
+                <w:i w:val="0"/>
+                <w:color w:val="0B0B0B"/>
+                <w:sz w:val="18"/>
+              </w:rPr>
+              <w:t xml:space="preserve"> El portapilas entra directo al pin de 5 V; el regulador de la placa baja a 3,3 V</w:t>
             </w:r>
           </w:p>
         </w:tc>
@@ -3018,7 +3700,7 @@
                 <w:color w:val="0B0B0B"/>
                 <w:sz w:val="18"/>
               </w:rPr>
-              <w:t>Conversión</w:t>
+              <w:t>Protección</w:t>
             </w:r>
           </w:p>
         </w:tc>
@@ -3038,7 +3720,7 @@
                 <w:color w:val="0B0B0B"/>
                 <w:sz w:val="18"/>
               </w:rPr>
-              <w:t>Elevador a 5 V, rendimiento ≈ 90 %, al pin de 5 V del nodo</w:t>
+              <w:t>Fusible de 1 A e interruptor entre el portapilas y la placa. No hay placa de protección: el firmware avisa a 4,5 V y marca crítico a 4,35 V</w:t>
             </w:r>
           </w:p>
         </w:tc>
@@ -3080,7 +3762,25 @@
                 <w:color w:val="0B0B0B"/>
                 <w:sz w:val="18"/>
               </w:rPr>
-              <w:t>Divisor 2:1 al ADC del ESP32</w:t>
+              <w:t xml:space="preserve">Divisor 150 kΩ / 100 kΩ (factor 2,5) al GPIO1. </w:t>
+            </w:r>
+            <w:r>
+              <w:rPr>
+                <w:b/>
+                <w:i w:val="0"/>
+                <w:color w:val="0B0B0B"/>
+                <w:sz w:val="18"/>
+              </w:rPr>
+              <w:t>Aún no está montado</w:t>
+            </w:r>
+            <w:r>
+              <w:rPr>
+                <w:b w:val="0"/>
+                <w:i w:val="0"/>
+                <w:color w:val="0B0B0B"/>
+                <w:sz w:val="18"/>
+              </w:rPr>
+              <w:t>: hasta entonces el nodo publica la batería como nula</w:t>
             </w:r>
           </w:p>
         </w:tc>
@@ -3122,16 +3822,16 @@
                 <w:color w:val="0B0B0B"/>
                 <w:sz w:val="18"/>
               </w:rPr>
-              <w:t>Fuera de la máquina.</w:t>
-            </w:r>
-            <w:r>
-              <w:rPr>
-                <w:b w:val="0"/>
-                <w:i w:val="0"/>
-                <w:color w:val="0B0B0B"/>
-                <w:sz w:val="18"/>
-              </w:rPr>
-              <w:t xml:space="preserve"> Dos juegos de paquetes: uno montado, otro cargando</w:t>
+              <w:t>Fuera de la máquina</w:t>
+            </w:r>
+            <w:r>
+              <w:rPr>
+                <w:b w:val="0"/>
+                <w:i w:val="0"/>
+                <w:color w:val="0B0B0B"/>
+                <w:sz w:val="18"/>
+              </w:rPr>
+              <w:t>, con el cargador de las pilas. Lo ideal son dos juegos: uno montado, otro cargando</w:t>
             </w:r>
           </w:p>
         </w:tc>
@@ -3150,7 +3850,7 @@
           <w:color w:val="0B0B0B"/>
           <w:sz w:val="21"/>
         </w:rPr>
-        <w:t>Por qué en paralelo y no en serie.</w:t>
+        <w:t>Por qué AA Ni-MH.</w:t>
       </w:r>
       <w:r>
         <w:rPr>
@@ -3159,10 +3859,20 @@
           <w:color w:val="0B0B0B"/>
           <w:sz w:val="21"/>
         </w:rPr>
-        <w:t xml:space="preserve"> En paralelo el paquete sigue siendo 1S: la protección y la carga son las de una sola celda, y la medida de tensión es directa. En serie harían falta balanceo y un BMS de 2S para ganar una eficiencia que el convertidor ya proporciona.</w:t>
+        <w:t xml:space="preserve"> Es una decisión del equipo (octubre de 2026) que sustituye a las 18650: pilas comunes, cargador sencillo, sin elevador ni placa de protección por nodo, y una química que soporta mejor el calor y el abuso que el Li-ion. El precio es la energía: unos 10,6 Wh frente a los 18,9 del paquete de dos 18650, y por eso la autonomía de las cámaras baja a unas 11 horas (§3.2).</w:t>
       </w:r>
     </w:p>
     <w:p>
+      <w:r>
+        <w:rPr>
+          <w:rFonts w:ascii="Consolas" w:hAnsi="Consolas"/>
+          <w:b/>
+          <w:i w:val="0"/>
+          <w:color w:val="8B2E2E"/>
+          <w:sz w:val="19"/>
+        </w:rPr>
+        <w:t>CAM04</w:t>
+      </w:r>
       <w:r>
         <w:rPr>
           <w:b/>
@@ -3170,7 +3880,7 @@
           <w:color w:val="0B0B0B"/>
           <w:sz w:val="21"/>
         </w:rPr>
-        <w:t>Por qué dos celdas y no una.</w:t>
+        <w:t xml:space="preserve"> ya no es una excepción.</w:t>
       </w:r>
       <w:r>
         <w:rPr>
@@ -3179,7 +3889,7 @@
           <w:color w:val="0B0B0B"/>
           <w:sz w:val="21"/>
         </w:rPr>
-        <w:t xml:space="preserve"> Con una sola celda, un nodo de cámara da unas 8,5 horas estimadas. Una jornada de cosecha puede pasar de diez, y ese margen se lo comen el envejecimiento de la celda, el calor y los reintentos de enlace.</w:t>
+        <w:t xml:space="preserve"> El LED de la tolva tiene su propia batería de 9 V (§3.6), así que su nodo lleva el mismo portapilas que los demás.</w:t>
       </w:r>
     </w:p>
     <w:p>
@@ -3406,7 +4116,7 @@
                 <w:color w:val="0B0B0B"/>
                 <w:sz w:val="18"/>
               </w:rPr>
-              <w:t>1,11 W</w:t>
+              <w:t>0,96 W</w:t>
             </w:r>
           </w:p>
         </w:tc>
@@ -3426,7 +4136,7 @@
                 <w:color w:val="0B0B0B"/>
                 <w:sz w:val="18"/>
               </w:rPr>
-              <w:t>≈ 17 h</w:t>
+              <w:t>≈ 11 h</w:t>
             </w:r>
           </w:p>
         </w:tc>
@@ -3448,7 +4158,7 @@
                 <w:color w:val="0B0B0B"/>
                 <w:sz w:val="18"/>
               </w:rPr>
-              <w:t>Nodo Hall</w:t>
+              <w:t>Cámara de tolva</w:t>
             </w:r>
           </w:p>
         </w:tc>
@@ -3468,7 +4178,7 @@
                 <w:color w:val="0B0B0B"/>
                 <w:sz w:val="18"/>
               </w:rPr>
-              <w:t>140 mA → 77 mA</w:t>
+              <w:t>200 mA</w:t>
             </w:r>
           </w:p>
         </w:tc>
@@ -3483,52 +4193,61 @@
             <w:r/>
             <w:r>
               <w:rPr>
+                <w:b w:val="0"/>
+                <w:i w:val="0"/>
+                <w:color w:val="0B0B0B"/>
+                <w:sz w:val="18"/>
+              </w:rPr>
+              <w:t>No</w:t>
+            </w:r>
+          </w:p>
+        </w:tc>
+        <w:tc>
+          <w:tcPr>
+            <w:tcW w:type="dxa" w:w="1928"/>
+          </w:tcPr>
+          <w:p>
+            <w:pPr>
+              <w:spacing w:after="40" w:before="40"/>
+            </w:pPr>
+            <w:r/>
+            <w:r>
+              <w:rPr>
+                <w:b w:val="0"/>
+                <w:i w:val="0"/>
+                <w:color w:val="0B0B0B"/>
+                <w:sz w:val="18"/>
+              </w:rPr>
+              <w:t>0,96 W</w:t>
+            </w:r>
+          </w:p>
+        </w:tc>
+        <w:tc>
+          <w:tcPr>
+            <w:tcW w:type="dxa" w:w="1928"/>
+          </w:tcPr>
+          <w:p>
+            <w:pPr>
+              <w:spacing w:after="40" w:before="40"/>
+            </w:pPr>
+            <w:r/>
+            <w:r>
+              <w:rPr>
                 <w:b/>
                 <w:i w:val="0"/>
                 <w:color w:val="0B0B0B"/>
                 <w:sz w:val="18"/>
               </w:rPr>
-              <w:t>Sí</w:t>
-            </w:r>
-          </w:p>
-        </w:tc>
-        <w:tc>
-          <w:tcPr>
-            <w:tcW w:type="dxa" w:w="1928"/>
-          </w:tcPr>
-          <w:p>
-            <w:pPr>
-              <w:spacing w:after="40" w:before="40"/>
-            </w:pPr>
-            <w:r/>
-            <w:r>
-              <w:rPr>
-                <w:b w:val="0"/>
-                <w:i w:val="0"/>
-                <w:color w:val="0B0B0B"/>
-                <w:sz w:val="18"/>
-              </w:rPr>
-              <w:t>0,43 W</w:t>
-            </w:r>
-          </w:p>
-        </w:tc>
-        <w:tc>
-          <w:tcPr>
-            <w:tcW w:type="dxa" w:w="1928"/>
-          </w:tcPr>
-          <w:p>
-            <w:pPr>
-              <w:spacing w:after="40" w:before="40"/>
-            </w:pPr>
-            <w:r/>
-            <w:r>
-              <w:rPr>
-                <w:b/>
-                <w:i w:val="0"/>
-                <w:color w:val="0B0B0B"/>
-                <w:sz w:val="18"/>
-              </w:rPr>
-              <w:t>≈ 44 h</w:t>
+              <w:t>≈ 11 h</w:t>
+            </w:r>
+            <w:r>
+              <w:rPr>
+                <w:b w:val="0"/>
+                <w:i w:val="0"/>
+                <w:color w:val="0B0B0B"/>
+                <w:sz w:val="18"/>
+              </w:rPr>
+              <w:t>; el LED gasta de su propia batería de 9 V (§3.6)</w:t>
             </w:r>
           </w:p>
         </w:tc>
@@ -3550,6 +4269,108 @@
                 <w:color w:val="0B0B0B"/>
                 <w:sz w:val="18"/>
               </w:rPr>
+              <w:t>Nodo Hall</w:t>
+            </w:r>
+          </w:p>
+        </w:tc>
+        <w:tc>
+          <w:tcPr>
+            <w:tcW w:type="dxa" w:w="1928"/>
+          </w:tcPr>
+          <w:p>
+            <w:pPr>
+              <w:spacing w:after="40" w:before="40"/>
+            </w:pPr>
+            <w:r/>
+            <w:r>
+              <w:rPr>
+                <w:b w:val="0"/>
+                <w:i w:val="0"/>
+                <w:color w:val="0B0B0B"/>
+                <w:sz w:val="18"/>
+              </w:rPr>
+              <w:t>140 mA → 77 mA</w:t>
+            </w:r>
+          </w:p>
+        </w:tc>
+        <w:tc>
+          <w:tcPr>
+            <w:tcW w:type="dxa" w:w="1928"/>
+          </w:tcPr>
+          <w:p>
+            <w:pPr>
+              <w:spacing w:after="40" w:before="40"/>
+            </w:pPr>
+            <w:r/>
+            <w:r>
+              <w:rPr>
+                <w:b/>
+                <w:i w:val="0"/>
+                <w:color w:val="0B0B0B"/>
+                <w:sz w:val="18"/>
+              </w:rPr>
+              <w:t>Sí</w:t>
+            </w:r>
+          </w:p>
+        </w:tc>
+        <w:tc>
+          <w:tcPr>
+            <w:tcW w:type="dxa" w:w="1928"/>
+          </w:tcPr>
+          <w:p>
+            <w:pPr>
+              <w:spacing w:after="40" w:before="40"/>
+            </w:pPr>
+            <w:r/>
+            <w:r>
+              <w:rPr>
+                <w:b w:val="0"/>
+                <w:i w:val="0"/>
+                <w:color w:val="0B0B0B"/>
+                <w:sz w:val="18"/>
+              </w:rPr>
+              <w:t>0,37 W</w:t>
+            </w:r>
+          </w:p>
+        </w:tc>
+        <w:tc>
+          <w:tcPr>
+            <w:tcW w:type="dxa" w:w="1928"/>
+          </w:tcPr>
+          <w:p>
+            <w:pPr>
+              <w:spacing w:after="40" w:before="40"/>
+            </w:pPr>
+            <w:r/>
+            <w:r>
+              <w:rPr>
+                <w:b/>
+                <w:i w:val="0"/>
+                <w:color w:val="0B0B0B"/>
+                <w:sz w:val="18"/>
+              </w:rPr>
+              <w:t>≈ 29 h</w:t>
+            </w:r>
+          </w:p>
+        </w:tc>
+      </w:tr>
+      <w:tr>
+        <w:tc>
+          <w:tcPr>
+            <w:tcW w:type="dxa" w:w="1928"/>
+          </w:tcPr>
+          <w:p>
+            <w:pPr>
+              <w:spacing w:after="40" w:before="40"/>
+            </w:pPr>
+            <w:r/>
+            <w:r>
+              <w:rPr>
+                <w:b w:val="0"/>
+                <w:i w:val="0"/>
+                <w:color w:val="0B0B0B"/>
+                <w:sz w:val="18"/>
+              </w:rPr>
               <w:t>Nodo ultrasónico</w:t>
             </w:r>
           </w:p>
@@ -3610,7 +4431,7 @@
                 <w:color w:val="0B0B0B"/>
                 <w:sz w:val="18"/>
               </w:rPr>
-              <w:t>0,44 W</w:t>
+              <w:t>0,38 W</w:t>
             </w:r>
           </w:p>
         </w:tc>
@@ -3630,7 +4451,7 @@
                 <w:color w:val="0B0B0B"/>
                 <w:sz w:val="18"/>
               </w:rPr>
-              <w:t>≈ 43 h</w:t>
+              <w:t>≈ 28 h</w:t>
             </w:r>
           </w:p>
         </w:tc>
@@ -3640,6 +4461,26 @@
       <w:pPr>
         <w:spacing w:after="80"/>
       </w:pPr>
+    </w:p>
+    <w:p>
+      <w:r>
+        <w:rPr>
+          <w:b/>
+          <w:i w:val="0"/>
+          <w:color w:val="0B0B0B"/>
+          <w:sz w:val="21"/>
+        </w:rPr>
+        <w:t>Once horas es justo para una jornada larga.</w:t>
+      </w:r>
+      <w:r>
+        <w:rPr>
+          <w:b w:val="0"/>
+          <w:i w:val="0"/>
+          <w:color w:val="0B0B0B"/>
+          <w:sz w:val="21"/>
+        </w:rPr>
+        <w:t xml:space="preserve"> Si la cosecha pasa de diez horas, hay que cambiar las pilas de las cámaras a mitad de jornada.</w:t>
+      </w:r>
     </w:p>
     <w:p>
       <w:pPr>
@@ -4068,7 +4909,7 @@
           <w:color w:val="0B0B0B"/>
           <w:sz w:val="20"/>
         </w:rPr>
-        <w:t>Las celdas de Li-ion no deben ir en una caja sellada y oscura expuesta al sol.</w:t>
+        <w:t>Ninguna batería debe ir en una caja sellada y oscura expuesta al sol.</w:t>
       </w:r>
       <w:r>
         <w:rPr>
@@ -4077,7 +4918,7 @@
           <w:color w:val="0B0B0B"/>
           <w:sz w:val="20"/>
         </w:rPr>
-        <w:t xml:space="preserve"> Una caja así en un arrozal colombiano pasa con facilidad de 60 °C internos, y por encima de esa temperatura una celda de Li-ion se degrada rápido y deja de ser segura.</w:t>
+        <w:t xml:space="preserve"> Una caja así en un arrozal colombiano pasa con facilidad de 60 °C internos. Las Ni-MH de los nodos pierden capacidad y vida rápidamente a esa temperatura, y la batería de 9 V del LED y la LiFePO4 de cabina tampoco deben cargarse en caliente.</w:t>
       </w:r>
     </w:p>
     <w:p>
@@ -4267,16 +5108,16 @@
                 <w:color w:val="0B0B0B"/>
                 <w:sz w:val="18"/>
               </w:rPr>
-              <w:t>Nunca dentro de la máquina.</w:t>
-            </w:r>
-            <w:r>
-              <w:rPr>
-                <w:b w:val="0"/>
-                <w:i w:val="0"/>
-                <w:color w:val="0B0B0B"/>
-                <w:sz w:val="18"/>
-              </w:rPr>
-              <w:t xml:space="preserve"> Cargar Li-ion por encima de 45 °C no es seguro</w:t>
+              <w:t>Nunca dentro de la máquina</w:t>
+            </w:r>
+            <w:r>
+              <w:rPr>
+                <w:b w:val="0"/>
+                <w:i w:val="0"/>
+                <w:color w:val="0B0B0B"/>
+                <w:sz w:val="18"/>
+              </w:rPr>
+              <w:t>, y nunca en caliente</w:t>
             </w:r>
           </w:p>
         </w:tc>
@@ -4298,7 +5139,7 @@
                 <w:color w:val="0B0B0B"/>
                 <w:sz w:val="18"/>
               </w:rPr>
-              <w:t>Celdas</w:t>
+              <w:t>Pilas</w:t>
             </w:r>
           </w:p>
         </w:tc>
@@ -4318,7 +5159,7 @@
                 <w:color w:val="0B0B0B"/>
                 <w:sz w:val="18"/>
               </w:rPr>
-              <w:t>Protegidas, o con placa de protección 1S. La descarga profunda arruina la celda</w:t>
+              <w:t>Sin placa de protección: hay que respetar el aviso de batería del HMI y no descargarlas por debajo de 1,0 V por pila</w:t>
             </w:r>
           </w:p>
         </w:tc>
@@ -4360,7 +5201,7 @@
                 <w:color w:val="0B0B0B"/>
                 <w:sz w:val="18"/>
               </w:rPr>
-              <w:t xml:space="preserve">Portapilas, </w:t>
+              <w:t xml:space="preserve">Portapilas de 4 AA con fusible e interruptor, </w:t>
             </w:r>
             <w:r>
               <w:rPr>
@@ -4369,16 +5210,7 @@
                 <w:color w:val="0B0B0B"/>
                 <w:sz w:val="18"/>
               </w:rPr>
-              <w:t>no soldar directamente a la celda</w:t>
-            </w:r>
-            <w:r>
-              <w:rPr>
-                <w:b w:val="0"/>
-                <w:i w:val="0"/>
-                <w:color w:val="0B0B0B"/>
-                <w:sz w:val="18"/>
-              </w:rPr>
-              <w:t xml:space="preserve"> sin soldadura por puntos</w:t>
+              <w:t>nunca pilas soldadas</w:t>
             </w:r>
           </w:p>
         </w:tc>
@@ -4420,7 +5252,7 @@
                 <w:color w:val="0B0B0B"/>
                 <w:sz w:val="18"/>
               </w:rPr>
-              <w:t>Rearmable, en serie con el paquete</w:t>
+              <w:t>1 A en serie con cada portapilas</w:t>
             </w:r>
           </w:p>
         </w:tc>
@@ -4463,6 +5295,48 @@
                 <w:sz w:val="18"/>
               </w:rPr>
               <w:t>Revisar las celdas al cambiarlas: hinchazón, corrosión o calor anómalo</w:t>
+            </w:r>
+          </w:p>
+        </w:tc>
+      </w:tr>
+      <w:tr>
+        <w:tc>
+          <w:tcPr>
+            <w:tcW w:type="dxa" w:w="4819"/>
+          </w:tcPr>
+          <w:p>
+            <w:pPr>
+              <w:spacing w:after="40" w:before="40"/>
+            </w:pPr>
+            <w:r/>
+            <w:r>
+              <w:rPr>
+                <w:b w:val="0"/>
+                <w:i w:val="0"/>
+                <w:color w:val="0B0B0B"/>
+                <w:sz w:val="18"/>
+              </w:rPr>
+              <w:t>Sonda del ultrasónico</w:t>
+            </w:r>
+          </w:p>
+        </w:tc>
+        <w:tc>
+          <w:tcPr>
+            <w:tcW w:type="dxa" w:w="4819"/>
+          </w:tcPr>
+          <w:p>
+            <w:pPr>
+              <w:spacing w:after="40" w:before="40"/>
+            </w:pPr>
+            <w:r/>
+            <w:r>
+              <w:rPr>
+                <w:b w:val="0"/>
+                <w:i w:val="0"/>
+                <w:color w:val="0B0B0B"/>
+                <w:sz w:val="18"/>
+              </w:rPr>
+              <w:t>El RCWL-1655 no tiene hoja de datos oficial: su rango de temperatura está sin confirmar. A la sombra, igual que las pilas</w:t>
             </w:r>
           </w:p>
         </w:tc>
@@ -4575,30 +5449,31 @@
             <w:r/>
             <w:r>
               <w:rPr>
-                <w:b w:val="0"/>
-                <w:i w:val="0"/>
-                <w:color w:val="0B0B0B"/>
-                <w:sz w:val="18"/>
-              </w:rPr>
-              <w:t xml:space="preserve">Convertidor DC-DC 12 V → 5 V, </w:t>
-            </w:r>
-            <w:r>
-              <w:rPr>
                 <w:b/>
                 <w:i w:val="0"/>
                 <w:color w:val="0B0B0B"/>
                 <w:sz w:val="18"/>
               </w:rPr>
-              <w:t>6 A mínimo</w:t>
-            </w:r>
-            <w:r>
-              <w:rPr>
-                <w:b w:val="0"/>
-                <w:i w:val="0"/>
-                <w:color w:val="0B0B0B"/>
-                <w:sz w:val="18"/>
-              </w:rPr>
-              <w:t>, de calidad</w:t>
+              <w:t>Batería LiFePO4 de 12,8 V y 12 Ah</w:t>
+            </w:r>
+            <w:r>
+              <w:rPr>
+                <w:b w:val="0"/>
+                <w:i w:val="0"/>
+                <w:color w:val="0B0B0B"/>
+                <w:sz w:val="18"/>
+              </w:rPr>
+              <w:t xml:space="preserve"> (≈ 150 Wh) con BMS, compartida con </w:t>
+            </w:r>
+            <w:r>
+              <w:rPr>
+                <w:rFonts w:ascii="Consolas" w:hAnsi="Consolas"/>
+                <w:b w:val="0"/>
+                <w:i w:val="0"/>
+                <w:color w:val="8B2E2E"/>
+                <w:sz w:val="16"/>
+              </w:rPr>
+              <w:t>AP01</w:t>
             </w:r>
           </w:p>
         </w:tc>
@@ -4620,7 +5495,7 @@
                 <w:color w:val="0B0B0B"/>
                 <w:sz w:val="18"/>
               </w:rPr>
-              <w:t>Consumo típico</w:t>
+              <w:t>Conversión</w:t>
             </w:r>
           </w:p>
         </w:tc>
@@ -4640,16 +5515,25 @@
                 <w:color w:val="0B0B0B"/>
                 <w:sz w:val="18"/>
               </w:rPr>
-              <w:t xml:space="preserve">≈ 9–12 W al 70 % de CPU con NVMe y Ethernet </w:t>
-            </w:r>
-            <w:r>
-              <w:rPr>
-                <w:b w:val="0"/>
-                <w:i/>
-                <w:color w:val="0B0B0B"/>
-                <w:sz w:val="18"/>
-              </w:rPr>
-              <w:t>(estimado)</w:t>
+              <w:t xml:space="preserve">Convertidor 12 V → 5 V con salida USB-C de </w:t>
+            </w:r>
+            <w:r>
+              <w:rPr>
+                <w:b/>
+                <w:i w:val="0"/>
+                <w:color w:val="0B0B0B"/>
+                <w:sz w:val="18"/>
+              </w:rPr>
+              <w:t>5 A</w:t>
+            </w:r>
+            <w:r>
+              <w:rPr>
+                <w:b w:val="0"/>
+                <w:i w:val="0"/>
+                <w:color w:val="0B0B0B"/>
+                <w:sz w:val="18"/>
+              </w:rPr>
+              <w:t xml:space="preserve"> para la Pi; un segundo convertidor 12 V → 9 V para el router Tenda N301</w:t>
             </w:r>
           </w:p>
         </w:tc>
@@ -4671,7 +5555,7 @@
                 <w:color w:val="0B0B0B"/>
                 <w:sz w:val="18"/>
               </w:rPr>
-              <w:t>Reserva local</w:t>
+              <w:t>Consumo típico</w:t>
             </w:r>
           </w:p>
         </w:tc>
@@ -4691,7 +5575,25 @@
                 <w:color w:val="0B0B0B"/>
                 <w:sz w:val="18"/>
               </w:rPr>
-              <w:t>1000 µF electrolíticos más cerámicos junto a la Pi</w:t>
+              <w:t xml:space="preserve">≈ 9–12 W al 70 % de CPU con NVMe y Ethernet </w:t>
+            </w:r>
+            <w:r>
+              <w:rPr>
+                <w:b w:val="0"/>
+                <w:i/>
+                <w:color w:val="0B0B0B"/>
+                <w:sz w:val="18"/>
+              </w:rPr>
+              <w:t>(estimado)</w:t>
+            </w:r>
+            <w:r>
+              <w:rPr>
+                <w:b w:val="0"/>
+                <w:i w:val="0"/>
+                <w:color w:val="0B0B0B"/>
+                <w:sz w:val="18"/>
+              </w:rPr>
+              <w:t>; menos en fase de dataset, que no infiere</w:t>
             </w:r>
           </w:p>
         </w:tc>
@@ -4713,7 +5615,7 @@
                 <w:color w:val="0B0B0B"/>
                 <w:sz w:val="18"/>
               </w:rPr>
-              <w:t>Protección</w:t>
+              <w:t>Autonomía estimada</w:t>
             </w:r>
           </w:p>
         </w:tc>
@@ -4733,7 +5635,7 @@
                 <w:color w:val="0B0B0B"/>
                 <w:sz w:val="18"/>
               </w:rPr>
-              <w:t>Fusible propio, independiente del resto</w:t>
+              <w:t>≈ 12 h con la Pi y el AP en fase de dataset; menos en fase de inferencia</w:t>
             </w:r>
           </w:p>
         </w:tc>
@@ -4755,6 +5657,90 @@
                 <w:color w:val="0B0B0B"/>
                 <w:sz w:val="18"/>
               </w:rPr>
+              <w:t>Reserva local</w:t>
+            </w:r>
+          </w:p>
+        </w:tc>
+        <w:tc>
+          <w:tcPr>
+            <w:tcW w:type="dxa" w:w="4819"/>
+          </w:tcPr>
+          <w:p>
+            <w:pPr>
+              <w:spacing w:after="40" w:before="40"/>
+            </w:pPr>
+            <w:r/>
+            <w:r>
+              <w:rPr>
+                <w:b w:val="0"/>
+                <w:i w:val="0"/>
+                <w:color w:val="0B0B0B"/>
+                <w:sz w:val="18"/>
+              </w:rPr>
+              <w:t>1000 µF electrolíticos más cerámicos junto a la Pi</w:t>
+            </w:r>
+          </w:p>
+        </w:tc>
+      </w:tr>
+      <w:tr>
+        <w:tc>
+          <w:tcPr>
+            <w:tcW w:type="dxa" w:w="4819"/>
+          </w:tcPr>
+          <w:p>
+            <w:pPr>
+              <w:spacing w:after="40" w:before="40"/>
+            </w:pPr>
+            <w:r/>
+            <w:r>
+              <w:rPr>
+                <w:b w:val="0"/>
+                <w:i w:val="0"/>
+                <w:color w:val="0B0B0B"/>
+                <w:sz w:val="18"/>
+              </w:rPr>
+              <w:t>Protección</w:t>
+            </w:r>
+          </w:p>
+        </w:tc>
+        <w:tc>
+          <w:tcPr>
+            <w:tcW w:type="dxa" w:w="4819"/>
+          </w:tcPr>
+          <w:p>
+            <w:pPr>
+              <w:spacing w:after="40" w:before="40"/>
+            </w:pPr>
+            <w:r/>
+            <w:r>
+              <w:rPr>
+                <w:b w:val="0"/>
+                <w:i w:val="0"/>
+                <w:color w:val="0B0B0B"/>
+                <w:sz w:val="18"/>
+              </w:rPr>
+              <w:t>Fusible general junto a la batería, y uno por rama (Pi y router)</w:t>
+            </w:r>
+          </w:p>
+        </w:tc>
+      </w:tr>
+      <w:tr>
+        <w:tc>
+          <w:tcPr>
+            <w:tcW w:type="dxa" w:w="4819"/>
+          </w:tcPr>
+          <w:p>
+            <w:pPr>
+              <w:spacing w:after="40" w:before="40"/>
+            </w:pPr>
+            <w:r/>
+            <w:r>
+              <w:rPr>
+                <w:b w:val="0"/>
+                <w:i w:val="0"/>
+                <w:color w:val="0B0B0B"/>
+                <w:sz w:val="18"/>
+              </w:rPr>
               <w:t>Apagado</w:t>
             </w:r>
           </w:p>
@@ -4770,12 +5756,21 @@
             <w:r/>
             <w:r>
               <w:rPr>
-                <w:b w:val="0"/>
-                <w:i w:val="0"/>
-                <w:color w:val="0B0B0B"/>
-                <w:sz w:val="18"/>
-              </w:rPr>
-              <w:t>Señal de contacto de la máquina a un GPIO, por optoacoplador</w:t>
+                <w:b/>
+                <w:i w:val="0"/>
+                <w:color w:val="0B0B0B"/>
+                <w:sz w:val="18"/>
+              </w:rPr>
+              <w:t>Manual</w:t>
+            </w:r>
+            <w:r>
+              <w:rPr>
+                <w:b w:val="0"/>
+                <w:i w:val="0"/>
+                <w:color w:val="0B0B0B"/>
+                <w:sz w:val="18"/>
+              </w:rPr>
+              <w:t>, antes de desconectar la batería</w:t>
             </w:r>
           </w:p>
         </w:tc>
@@ -4794,7 +5789,7 @@
           <w:color w:val="0B0B0B"/>
           <w:sz w:val="21"/>
         </w:rPr>
-        <w:t>Por qué 6 A para algo que consume 12 W.</w:t>
+        <w:t>Por qué una LiFePO4 de 12 V y no el paquete 3S5P de la versión 1.1.</w:t>
       </w:r>
       <w:r>
         <w:rPr>
@@ -4803,7 +5798,27 @@
           <w:color w:val="0B0B0B"/>
           <w:sz w:val="21"/>
         </w:rPr>
-        <w:t xml:space="preserve"> Raspberry Pi recomienda 5 V / 5 A para la Pi 5, no porque consuma 25 W de forma continua, sino porque el sistema de gestión de energía necesita margen para los picos y </w:t>
+        <w:t xml:space="preserve"> Es una sola pieza de unos 150 Wh, en lugar de quince celdas que cargar una a una; tolera mejor el calor y admite miles de ciclos. Desde 12 V, la Pi y el router toman en conjunto del orden de 1 A. Su BMS corta en seco cuando la batería se agota, y eso equivale a desenchufar la Pi: hay que apagar antes.</w:t>
+      </w:r>
+    </w:p>
+    <w:p>
+      <w:r>
+        <w:rPr>
+          <w:b/>
+          <w:i w:val="0"/>
+          <w:color w:val="0B0B0B"/>
+          <w:sz w:val="21"/>
+        </w:rPr>
+        <w:t>Por qué 5 A, y por qué no una powerbank.</w:t>
+      </w:r>
+      <w:r>
+        <w:rPr>
+          <w:b w:val="0"/>
+          <w:i w:val="0"/>
+          <w:color w:val="0B0B0B"/>
+          <w:sz w:val="21"/>
+        </w:rPr>
+        <w:t xml:space="preserve"> Raspberry Pi especifica 5 V / 5 A para la Pi 5 mediante un perfil de carga propio, no porque consuma 25 W de forma continua, sino porque el sistema de gestión de energía necesita margen para los picos y </w:t>
       </w:r>
       <w:r>
         <w:rPr>
@@ -4821,7 +5836,7 @@
           <w:color w:val="0B0B0B"/>
           <w:sz w:val="21"/>
         </w:rPr>
-        <w:t>. Un convertidor genérico de 3 A con cable fino produce reinicios por subtensión, que es el fallo más común y más difícil de diagnosticar en despliegues de este tipo.</w:t>
+        <w:t>. La mayoría de powerbanks entregan como mucho 5 V / 3 A: es la misma situación que un convertidor genérico de 3 A con cable fino, que produce reinicios por subtensión, el fallo más común y más difícil de diagnosticar en despliegues de este tipo.</w:t>
       </w:r>
     </w:p>
     <w:p>
@@ -4832,7 +5847,7 @@
           <w:color w:val="0B0B0B"/>
           <w:sz w:val="21"/>
         </w:rPr>
-        <w:t>El apagado ordenado es el fallo nuevo que introduce usar una Pi.</w:t>
+        <w:t>El convertidor no habla USB-PD.</w:t>
       </w:r>
       <w:r>
         <w:rPr>
@@ -4841,7 +5856,672 @@
           <w:color w:val="0B0B0B"/>
           <w:sz w:val="21"/>
         </w:rPr>
-        <w:t xml:space="preserve"> Un ESP32 se desconecta en caliente casi impunemente; una Raspberry Pi no. Al girar la llave, la señal de contacto dispara el cierre de la base, la consolidación del disco y el apagado limpio.</w:t>
+        <w:t xml:space="preserve"> Sin negociación PD, la Pi 5 avisa al arrancar y limita los USB a 600 mA. Con </w:t>
+      </w:r>
+      <w:r>
+        <w:rPr>
+          <w:rFonts w:ascii="Consolas" w:hAnsi="Consolas"/>
+          <w:b w:val="0"/>
+          <w:i w:val="0"/>
+          <w:color w:val="8B2E2E"/>
+          <w:sz w:val="19"/>
+        </w:rPr>
+        <w:t>usb_max_current_enable=1</w:t>
+      </w:r>
+      <w:r>
+        <w:rPr>
+          <w:b w:val="0"/>
+          <w:i w:val="0"/>
+          <w:color w:val="0B0B0B"/>
+          <w:sz w:val="21"/>
+        </w:rPr>
+        <w:t xml:space="preserve"> en </w:t>
+      </w:r>
+      <w:r>
+        <w:rPr>
+          <w:rFonts w:ascii="Consolas" w:hAnsi="Consolas"/>
+          <w:b w:val="0"/>
+          <w:i w:val="0"/>
+          <w:color w:val="8B2E2E"/>
+          <w:sz w:val="19"/>
+        </w:rPr>
+        <w:t>config.txt</w:t>
+      </w:r>
+      <w:r>
+        <w:rPr>
+          <w:b w:val="0"/>
+          <w:i w:val="0"/>
+          <w:color w:val="0B0B0B"/>
+          <w:sz w:val="21"/>
+        </w:rPr>
+        <w:t xml:space="preserve"> acepta la fuente de 5 A. Hay que medir que el convertidor no pase de 5,1 V y vigilar los avisos de subtensión.</w:t>
+      </w:r>
+    </w:p>
+    <w:p>
+      <w:r>
+        <w:rPr>
+          <w:b/>
+          <w:i w:val="0"/>
+          <w:color w:val="0B0B0B"/>
+          <w:sz w:val="21"/>
+        </w:rPr>
+        <w:t>Cómo se carga.</w:t>
+      </w:r>
+      <w:r>
+        <w:rPr>
+          <w:b w:val="0"/>
+          <w:i w:val="0"/>
+          <w:color w:val="0B0B0B"/>
+          <w:sz w:val="21"/>
+        </w:rPr>
+        <w:t xml:space="preserve"> Fuera de la máquina, con un cargador LiFePO4 de 14,6 V; con 2 A, una noche.</w:t>
+      </w:r>
+    </w:p>
+    <w:p>
+      <w:r>
+        <w:rPr>
+          <w:b/>
+          <w:i w:val="0"/>
+          <w:color w:val="0B0B0B"/>
+          <w:sz w:val="21"/>
+        </w:rPr>
+        <w:t>El apagado sigue siendo el fallo nuevo que introduce usar una Pi.</w:t>
+      </w:r>
+      <w:r>
+        <w:rPr>
+          <w:b w:val="0"/>
+          <w:i w:val="0"/>
+          <w:color w:val="0B0B0B"/>
+          <w:sz w:val="21"/>
+        </w:rPr>
+        <w:t xml:space="preserve"> Un ESP32 se desconecta en caliente casi impunemente; una Raspberry Pi no. Hay que parar el servicio y esperar a que la Pi se apague </w:t>
+      </w:r>
+      <w:r>
+        <w:rPr>
+          <w:b/>
+          <w:i w:val="0"/>
+          <w:color w:val="0B0B0B"/>
+          <w:sz w:val="21"/>
+        </w:rPr>
+        <w:t>antes</w:t>
+      </w:r>
+      <w:r>
+        <w:rPr>
+          <w:b w:val="0"/>
+          <w:i w:val="0"/>
+          <w:color w:val="0B0B0B"/>
+          <w:sz w:val="21"/>
+        </w:rPr>
+        <w:t xml:space="preserve"> de desconectar o cambiar la batería. </w:t>
+      </w:r>
+      <w:r>
+        <w:rPr>
+          <w:b/>
+          <w:i w:val="0"/>
+          <w:color w:val="0B0B0B"/>
+          <w:sz w:val="21"/>
+        </w:rPr>
+        <w:t>Los nodos no llevan microSD:</w:t>
+      </w:r>
+      <w:r>
+        <w:rPr>
+          <w:b w:val="0"/>
+          <w:i w:val="0"/>
+          <w:color w:val="0B0B0B"/>
+          <w:sz w:val="21"/>
+        </w:rPr>
+        <w:t xml:space="preserve"> mientras la central está apagada, los frames que capturan se pierden (el LED del nodo lo indica en ámbar). Por eso el cambio de batería se hace con la máquina parada, entre tolvadas, nunca en medio de una pasada.</w:t>
+      </w:r>
+    </w:p>
+    <w:p>
+      <w:pPr>
+        <w:keepNext/>
+        <w:spacing w:before="200" w:after="120"/>
+      </w:pPr>
+      <w:r>
+        <w:rPr>
+          <w:b/>
+          <w:i w:val="0"/>
+          <w:color w:val="0B0B0B"/>
+          <w:sz w:val="25"/>
+        </w:rPr>
+        <w:t>3.6 La iluminación de la tolva</w:t>
+      </w:r>
+    </w:p>
+    <w:p>
+      <w:r>
+        <w:rPr>
+          <w:b w:val="0"/>
+          <w:i w:val="0"/>
+          <w:color w:val="0B0B0B"/>
+          <w:sz w:val="21"/>
+        </w:rPr>
+        <w:t>La tolva va cubierta, así que dentro está oscuro: el LED no compite con el sol y solo tiene que alumbrar un recinto cerrado. Eso abarata la iluminación.</w:t>
+      </w:r>
+    </w:p>
+    <w:tbl>
+      <w:tblPr>
+        <w:tblStyle w:val="TableGrid"/>
+        <w:tblW w:type="auto" w:w="0"/>
+        <w:jc w:val="center"/>
+        <w:tblLook w:firstColumn="1" w:firstRow="1" w:lastColumn="0" w:lastRow="0" w:noHBand="0" w:noVBand="1" w:val="04A0"/>
+      </w:tblPr>
+      <w:tblGrid>
+        <w:gridCol w:w="4819"/>
+        <w:gridCol w:w="4819"/>
+      </w:tblGrid>
+      <w:tr>
+        <w:tc>
+          <w:tcPr>
+            <w:tcW w:type="dxa" w:w="4819"/>
+            <w:shd w:val="clear" w:color="auto" w:fill="E8EDF6"/>
+          </w:tcPr>
+          <w:p>
+            <w:pPr>
+              <w:spacing w:after="40" w:before="40"/>
+            </w:pPr>
+            <w:r/>
+            <w:r>
+              <w:rPr>
+                <w:b/>
+                <w:i w:val="0"/>
+                <w:color w:val="0B0B0B"/>
+                <w:sz w:val="18"/>
+              </w:rPr>
+              <w:t>Elemento</w:t>
+            </w:r>
+          </w:p>
+        </w:tc>
+        <w:tc>
+          <w:tcPr>
+            <w:tcW w:type="dxa" w:w="4819"/>
+            <w:shd w:val="clear" w:color="auto" w:fill="E8EDF6"/>
+          </w:tcPr>
+          <w:p>
+            <w:pPr>
+              <w:spacing w:after="40" w:before="40"/>
+            </w:pPr>
+            <w:r/>
+            <w:r>
+              <w:rPr>
+                <w:b/>
+                <w:i w:val="0"/>
+                <w:color w:val="0B0B0B"/>
+                <w:sz w:val="18"/>
+              </w:rPr>
+              <w:t>Especificación</w:t>
+            </w:r>
+          </w:p>
+        </w:tc>
+      </w:tr>
+      <w:tr>
+        <w:tc>
+          <w:tcPr>
+            <w:tcW w:type="dxa" w:w="4819"/>
+          </w:tcPr>
+          <w:p>
+            <w:pPr>
+              <w:spacing w:after="40" w:before="40"/>
+            </w:pPr>
+            <w:r/>
+            <w:r>
+              <w:rPr>
+                <w:b w:val="0"/>
+                <w:i w:val="0"/>
+                <w:color w:val="0B0B0B"/>
+                <w:sz w:val="18"/>
+              </w:rPr>
+              <w:t>Fuente de luz</w:t>
+            </w:r>
+          </w:p>
+        </w:tc>
+        <w:tc>
+          <w:tcPr>
+            <w:tcW w:type="dxa" w:w="4819"/>
+          </w:tcPr>
+          <w:p>
+            <w:pPr>
+              <w:spacing w:after="40" w:before="40"/>
+            </w:pPr>
+            <w:r/>
+            <w:r>
+              <w:rPr>
+                <w:b w:val="0"/>
+                <w:i w:val="0"/>
+                <w:color w:val="0B0B0B"/>
+                <w:sz w:val="18"/>
+              </w:rPr>
+              <w:t xml:space="preserve">Módulo de inyección de 12 V con 3 LED (cable rojo +, blanco −). Potencia probable de 1 a 1,5 W, </w:t>
+            </w:r>
+            <w:r>
+              <w:rPr>
+                <w:b/>
+                <w:i w:val="0"/>
+                <w:color w:val="0B0B0B"/>
+                <w:sz w:val="18"/>
+              </w:rPr>
+              <w:t>sin confirmar</w:t>
+            </w:r>
+          </w:p>
+        </w:tc>
+      </w:tr>
+      <w:tr>
+        <w:tc>
+          <w:tcPr>
+            <w:tcW w:type="dxa" w:w="4819"/>
+          </w:tcPr>
+          <w:p>
+            <w:pPr>
+              <w:spacing w:after="40" w:before="40"/>
+            </w:pPr>
+            <w:r/>
+            <w:r>
+              <w:rPr>
+                <w:b w:val="0"/>
+                <w:i w:val="0"/>
+                <w:color w:val="0B0B0B"/>
+                <w:sz w:val="18"/>
+              </w:rPr>
+              <w:t>Alimentación</w:t>
+            </w:r>
+          </w:p>
+        </w:tc>
+        <w:tc>
+          <w:tcPr>
+            <w:tcW w:type="dxa" w:w="4819"/>
+          </w:tcPr>
+          <w:p>
+            <w:pPr>
+              <w:spacing w:after="40" w:before="40"/>
+            </w:pPr>
+            <w:r/>
+            <w:r>
+              <w:rPr>
+                <w:b/>
+                <w:i w:val="0"/>
+                <w:color w:val="0B0B0B"/>
+                <w:sz w:val="18"/>
+              </w:rPr>
+              <w:t>Batería recargable de 9 V (PP3, 250 mAh) propia</w:t>
+            </w:r>
+            <w:r>
+              <w:rPr>
+                <w:b w:val="0"/>
+                <w:i w:val="0"/>
+                <w:color w:val="0B0B0B"/>
+                <w:sz w:val="18"/>
+              </w:rPr>
+              <w:t>, sin driver ni elevador. No toca el portapilas del nodo</w:t>
+            </w:r>
+          </w:p>
+        </w:tc>
+      </w:tr>
+      <w:tr>
+        <w:tc>
+          <w:tcPr>
+            <w:tcW w:type="dxa" w:w="4819"/>
+          </w:tcPr>
+          <w:p>
+            <w:pPr>
+              <w:spacing w:after="40" w:before="40"/>
+            </w:pPr>
+            <w:r/>
+            <w:r>
+              <w:rPr>
+                <w:b w:val="0"/>
+                <w:i w:val="0"/>
+                <w:color w:val="0B0B0B"/>
+                <w:sz w:val="18"/>
+              </w:rPr>
+              <w:t>Encendido</w:t>
+            </w:r>
+          </w:p>
+        </w:tc>
+        <w:tc>
+          <w:tcPr>
+            <w:tcW w:type="dxa" w:w="4819"/>
+          </w:tcPr>
+          <w:p>
+            <w:pPr>
+              <w:spacing w:after="40" w:before="40"/>
+            </w:pPr>
+            <w:r/>
+            <w:r>
+              <w:rPr>
+                <w:b/>
+                <w:i w:val="0"/>
+                <w:color w:val="0B0B0B"/>
+                <w:sz w:val="18"/>
+              </w:rPr>
+              <w:t>Pulsado</w:t>
+            </w:r>
+            <w:r>
+              <w:rPr>
+                <w:b w:val="0"/>
+                <w:i w:val="0"/>
+                <w:color w:val="0B0B0B"/>
+                <w:sz w:val="18"/>
+              </w:rPr>
+              <w:t>, solo alrededor de cada foto: MOSFET IRLZ44N en lado bajo, puerta en G14 por 200 Ω y 100 kΩ a GND, fusible de 1 A</w:t>
+            </w:r>
+          </w:p>
+        </w:tc>
+      </w:tr>
+      <w:tr>
+        <w:tc>
+          <w:tcPr>
+            <w:tcW w:type="dxa" w:w="4819"/>
+          </w:tcPr>
+          <w:p>
+            <w:pPr>
+              <w:spacing w:after="40" w:before="40"/>
+            </w:pPr>
+            <w:r/>
+            <w:r>
+              <w:rPr>
+                <w:b w:val="0"/>
+                <w:i w:val="0"/>
+                <w:color w:val="0B0B0B"/>
+                <w:sz w:val="18"/>
+              </w:rPr>
+              <w:t>Firmware</w:t>
+            </w:r>
+          </w:p>
+        </w:tc>
+        <w:tc>
+          <w:tcPr>
+            <w:tcW w:type="dxa" w:w="4819"/>
+          </w:tcPr>
+          <w:p>
+            <w:pPr>
+              <w:spacing w:after="40" w:before="40"/>
+            </w:pPr>
+            <w:r/>
+            <w:r>
+              <w:rPr>
+                <w:b/>
+                <w:i w:val="0"/>
+                <w:color w:val="0B0B0B"/>
+                <w:sz w:val="18"/>
+              </w:rPr>
+              <w:t>Pendiente:</w:t>
+            </w:r>
+            <w:r>
+              <w:rPr>
+                <w:b w:val="0"/>
+                <w:i w:val="0"/>
+                <w:color w:val="0B0B0B"/>
+                <w:sz w:val="18"/>
+              </w:rPr>
+              <w:t xml:space="preserve"> </w:t>
+            </w:r>
+            <w:r>
+              <w:rPr>
+                <w:rFonts w:ascii="Consolas" w:hAnsi="Consolas"/>
+                <w:b w:val="0"/>
+                <w:i w:val="0"/>
+                <w:color w:val="8B2E2E"/>
+                <w:sz w:val="16"/>
+              </w:rPr>
+              <w:t>camara.ino</w:t>
+            </w:r>
+            <w:r>
+              <w:rPr>
+                <w:b w:val="0"/>
+                <w:i w:val="0"/>
+                <w:color w:val="0B0B0B"/>
+                <w:sz w:val="18"/>
+              </w:rPr>
+              <w:t xml:space="preserve"> todavía no maneja el LED</w:t>
+            </w:r>
+          </w:p>
+        </w:tc>
+      </w:tr>
+      <w:tr>
+        <w:tc>
+          <w:tcPr>
+            <w:tcW w:type="dxa" w:w="4819"/>
+          </w:tcPr>
+          <w:p>
+            <w:pPr>
+              <w:spacing w:after="40" w:before="40"/>
+            </w:pPr>
+            <w:r/>
+            <w:r>
+              <w:rPr>
+                <w:b w:val="0"/>
+                <w:i w:val="0"/>
+                <w:color w:val="0B0B0B"/>
+                <w:sz w:val="18"/>
+              </w:rPr>
+              <w:t>Ventana</w:t>
+            </w:r>
+          </w:p>
+        </w:tc>
+        <w:tc>
+          <w:tcPr>
+            <w:tcW w:type="dxa" w:w="4819"/>
+          </w:tcPr>
+          <w:p>
+            <w:pPr>
+              <w:spacing w:after="40" w:before="40"/>
+            </w:pPr>
+            <w:r/>
+            <w:r>
+              <w:rPr>
+                <w:b w:val="0"/>
+                <w:i w:val="0"/>
+                <w:color w:val="0B0B0B"/>
+                <w:sz w:val="18"/>
+              </w:rPr>
+              <w:t>150–300 ms por foto, que llegará en el plan como cualquier otro parámetro</w:t>
+            </w:r>
+          </w:p>
+        </w:tc>
+      </w:tr>
+      <w:tr>
+        <w:tc>
+          <w:tcPr>
+            <w:tcW w:type="dxa" w:w="4819"/>
+          </w:tcPr>
+          <w:p>
+            <w:pPr>
+              <w:spacing w:after="40" w:before="40"/>
+            </w:pPr>
+            <w:r/>
+            <w:r>
+              <w:rPr>
+                <w:b w:val="0"/>
+                <w:i w:val="0"/>
+                <w:color w:val="0B0B0B"/>
+                <w:sz w:val="18"/>
+              </w:rPr>
+              <w:t>Montaje</w:t>
+            </w:r>
+          </w:p>
+        </w:tc>
+        <w:tc>
+          <w:tcPr>
+            <w:tcW w:type="dxa" w:w="4819"/>
+          </w:tcPr>
+          <w:p>
+            <w:pPr>
+              <w:spacing w:after="40" w:before="40"/>
+            </w:pPr>
+            <w:r/>
+            <w:r>
+              <w:rPr>
+                <w:b w:val="0"/>
+                <w:i w:val="0"/>
+                <w:color w:val="0B0B0B"/>
+                <w:sz w:val="18"/>
+              </w:rPr>
+              <w:t>Separado de la cámara, alumbrando en oblicuo</w:t>
+            </w:r>
+          </w:p>
+        </w:tc>
+      </w:tr>
+    </w:tbl>
+    <w:p>
+      <w:pPr>
+        <w:spacing w:after="80"/>
+      </w:pPr>
+    </w:p>
+    <w:p>
+      <w:r>
+        <w:rPr>
+          <w:b/>
+          <w:i w:val="0"/>
+          <w:color w:val="0B0B0B"/>
+          <w:sz w:val="21"/>
+        </w:rPr>
+        <w:t>Por qué pulsado.</w:t>
+      </w:r>
+      <w:r>
+        <w:rPr>
+          <w:b w:val="0"/>
+          <w:i w:val="0"/>
+          <w:color w:val="0B0B0B"/>
+          <w:sz w:val="21"/>
+        </w:rPr>
+        <w:t xml:space="preserve"> </w:t>
+      </w:r>
+      <w:r>
+        <w:rPr>
+          <w:rFonts w:ascii="Consolas" w:hAnsi="Consolas"/>
+          <w:b w:val="0"/>
+          <w:i w:val="0"/>
+          <w:color w:val="8B2E2E"/>
+          <w:sz w:val="19"/>
+        </w:rPr>
+        <w:t>CAM04</w:t>
+      </w:r>
+      <w:r>
+        <w:rPr>
+          <w:b w:val="0"/>
+          <w:i w:val="0"/>
+          <w:color w:val="0B0B0B"/>
+          <w:sz w:val="21"/>
+        </w:rPr>
+        <w:t xml:space="preserve"> toma una foto cada dos segundos. Una PP3 de 250 mAh con el LED siempre encendido duraría poco más de una hora; encendido solo durante la foto, el consumo baja unas diez veces.</w:t>
+      </w:r>
+    </w:p>
+    <w:p>
+      <w:r>
+        <w:rPr>
+          <w:b/>
+          <w:i w:val="0"/>
+          <w:color w:val="0B0B0B"/>
+          <w:sz w:val="21"/>
+        </w:rPr>
+        <w:t>El límite de los 9 V.</w:t>
+      </w:r>
+      <w:r>
+        <w:rPr>
+          <w:b w:val="0"/>
+          <w:i w:val="0"/>
+          <w:color w:val="0B0B0B"/>
+          <w:sz w:val="21"/>
+        </w:rPr>
+        <w:t xml:space="preserve"> Un módulo de 12 V alimentado a 9 V da bastante menos luz, y el brillo baja a medida que se descarga la batería. La autonomía real y la exposición hay que medirlas en el banco. Si no alcanza, el mismo cableado admite una batería de 12 V.</w:t>
+      </w:r>
+    </w:p>
+    <w:p>
+      <w:r>
+        <w:rPr>
+          <w:b/>
+          <w:i w:val="0"/>
+          <w:color w:val="0B0B0B"/>
+          <w:sz w:val="21"/>
+        </w:rPr>
+        <w:t>Por qué en oblicuo y separado de la cámara.</w:t>
+      </w:r>
+      <w:r>
+        <w:rPr>
+          <w:b w:val="0"/>
+          <w:i w:val="0"/>
+          <w:color w:val="0B0B0B"/>
+          <w:sz w:val="21"/>
+        </w:rPr>
+        <w:t xml:space="preserve"> Dentro de una tolva cerrada hay mucho polvo. Un LED junto al objetivo devuelve luz dispersa —el efecto de los faros en la niebla— y refleja brillos en el grano. La luz lateral, además, realza la textura, que es lo que distingue el grano de la paja y la cascarilla.</w:t>
+      </w:r>
+    </w:p>
+    <w:p>
+      <w:r>
+        <w:rPr>
+          <w:b/>
+          <w:i w:val="0"/>
+          <w:color w:val="0B0B0B"/>
+          <w:sz w:val="21"/>
+        </w:rPr>
+        <w:t>Cuidado con la sincronía.</w:t>
+      </w:r>
+      <w:r>
+        <w:rPr>
+          <w:b w:val="0"/>
+          <w:i w:val="0"/>
+          <w:color w:val="0B0B0B"/>
+          <w:sz w:val="21"/>
+        </w:rPr>
+        <w:t xml:space="preserve"> El driver de cámara guarda cuadros en memoria: si se enciende el LED y se captura de inmediato, la foto puede ser de antes del encendido. El orden es encender, descartar uno o dos cuadros, capturar y apagar. Hay que comprobar en el banco que </w:t>
+      </w:r>
+      <w:r>
+        <w:rPr>
+          <w:b/>
+          <w:i w:val="0"/>
+          <w:color w:val="0B0B0B"/>
+          <w:sz w:val="21"/>
+        </w:rPr>
+        <w:t>todas</w:t>
+      </w:r>
+      <w:r>
+        <w:rPr>
+          <w:b w:val="0"/>
+          <w:i w:val="0"/>
+          <w:color w:val="0B0B0B"/>
+          <w:sz w:val="21"/>
+        </w:rPr>
+        <w:t xml:space="preserve"> las fotos guardadas salen iluminadas.</w:t>
+      </w:r>
+    </w:p>
+    <w:p>
+      <w:r>
+        <w:rPr>
+          <w:b/>
+          <w:i w:val="0"/>
+          <w:color w:val="0B0B0B"/>
+          <w:sz w:val="21"/>
+        </w:rPr>
+        <w:t>Lo que el LED no arregla.</w:t>
+      </w:r>
+      <w:r>
+        <w:rPr>
+          <w:b w:val="0"/>
+          <w:i w:val="0"/>
+          <w:color w:val="0B0B0B"/>
+          <w:sz w:val="21"/>
+        </w:rPr>
+        <w:t xml:space="preserve"> La superficie sube al llenarse la tolva y se acerca al LED: entre metro y medio y medio metro, la iluminación se multiplica por nueve. Con exposición manual fija, las fotos del final de la tolvada saldrán más claras que las del principio. Es la misma razón por la que el análisis debe acotarse según el nivel de llenado, ahora por dos motivos: resolución y brillo. La referencia de color sirve además para notar cuándo el polvo acumulado sobre el LED está quitando luz.</w:t>
+      </w:r>
+    </w:p>
+    <w:p>
+      <w:r>
+        <w:rPr>
+          <w:b/>
+          <w:i w:val="0"/>
+          <w:color w:val="0B0B0B"/>
+          <w:sz w:val="21"/>
+        </w:rPr>
+        <w:t>La batería va fuera de la tolva.</w:t>
+      </w:r>
+      <w:r>
+        <w:rPr>
+          <w:b w:val="0"/>
+          <w:i w:val="0"/>
+          <w:color w:val="0B0B0B"/>
+          <w:sz w:val="21"/>
+        </w:rPr>
+        <w:t xml:space="preserve"> Dentro solo la cámara y el LED. Dentro hay polvo de grano, que es combustible, y grano que puede golpear o enterrar la caja. Y conviene mirar dónde queda el motor en la máquina: en muchas cosechadoras está detrás o debajo de la tolva.</w:t>
       </w:r>
     </w:p>
     <w:p>
@@ -4892,7 +6572,7 @@
       <w:r>
         <w:drawing>
           <wp:inline xmlns:a="http://schemas.openxmlformats.org/drawingml/2006/main" xmlns:pic="http://schemas.openxmlformats.org/drawingml/2006/picture">
-            <wp:extent cx="6120000" cy="1436327"/>
+            <wp:extent cx="6120000" cy="5175459"/>
             <wp:docPr id="3" name="Picture 3"/>
             <wp:cNvGraphicFramePr>
               <a:graphicFrameLocks noChangeAspect="1"/>
@@ -4913,7 +6593,7 @@
                   <pic:spPr>
                     <a:xfrm>
                       <a:off x="0" y="0"/>
-                      <a:ext cx="6120000" cy="1436327"/>
+                      <a:ext cx="6120000" cy="5175459"/>
                     </a:xfrm>
                     <a:prstGeom prst="rect"/>
                   </pic:spPr>
@@ -5179,7 +6859,7 @@
                 <w:color w:val="0B0B0B"/>
                 <w:sz w:val="18"/>
               </w:rPr>
-              <w:t>Estanca, antena orientada hacia los nodos, lo más alta posible, lejos de masas metálicas</w:t>
+              <w:t>Estanca, antena orientada hacia los nodos, lo más alta posible, lejos de masas metálicas. Es un router Tenda N301 a 9 V; su alimentación baja de la batería de cabina, junto al cable Ethernet</w:t>
             </w:r>
           </w:p>
         </w:tc>
@@ -5201,6 +6881,48 @@
                 <w:color w:val="0B0B0B"/>
                 <w:sz w:val="18"/>
               </w:rPr>
+              <w:t>Batería de la central</w:t>
+            </w:r>
+          </w:p>
+        </w:tc>
+        <w:tc>
+          <w:tcPr>
+            <w:tcW w:type="dxa" w:w="4819"/>
+          </w:tcPr>
+          <w:p>
+            <w:pPr>
+              <w:spacing w:after="40" w:before="40"/>
+            </w:pPr>
+            <w:r/>
+            <w:r>
+              <w:rPr>
+                <w:b w:val="0"/>
+                <w:i w:val="0"/>
+                <w:color w:val="0B0B0B"/>
+                <w:sz w:val="18"/>
+              </w:rPr>
+              <w:t>LiFePO4 en cabina, a la sombra, sujeta y accesible para cambiarla sin herramientas</w:t>
+            </w:r>
+          </w:p>
+        </w:tc>
+      </w:tr>
+      <w:tr>
+        <w:tc>
+          <w:tcPr>
+            <w:tcW w:type="dxa" w:w="4819"/>
+          </w:tcPr>
+          <w:p>
+            <w:pPr>
+              <w:spacing w:after="40" w:before="40"/>
+            </w:pPr>
+            <w:r/>
+            <w:r>
+              <w:rPr>
+                <w:b w:val="0"/>
+                <w:i w:val="0"/>
+                <w:color w:val="0B0B0B"/>
+                <w:sz w:val="18"/>
+              </w:rPr>
               <w:t>Cajas de cámara</w:t>
             </w:r>
           </w:p>
@@ -5240,6 +6962,66 @@
                 <w:sz w:val="18"/>
               </w:rPr>
               <w:t>, orientación fijada y documentada</w:t>
+            </w:r>
+          </w:p>
+        </w:tc>
+      </w:tr>
+      <w:tr>
+        <w:tc>
+          <w:tcPr>
+            <w:tcW w:type="dxa" w:w="4819"/>
+          </w:tcPr>
+          <w:p>
+            <w:pPr>
+              <w:spacing w:after="40" w:before="40"/>
+            </w:pPr>
+            <w:r/>
+            <w:r>
+              <w:rPr>
+                <w:b w:val="0"/>
+                <w:i w:val="0"/>
+                <w:color w:val="0B0B0B"/>
+                <w:sz w:val="18"/>
+              </w:rPr>
+              <w:t>LED de la tolva y su batería</w:t>
+            </w:r>
+          </w:p>
+        </w:tc>
+        <w:tc>
+          <w:tcPr>
+            <w:tcW w:type="dxa" w:w="4819"/>
+          </w:tcPr>
+          <w:p>
+            <w:pPr>
+              <w:spacing w:after="40" w:before="40"/>
+            </w:pPr>
+            <w:r/>
+            <w:r>
+              <w:rPr>
+                <w:b w:val="0"/>
+                <w:i w:val="0"/>
+                <w:color w:val="0B0B0B"/>
+                <w:sz w:val="18"/>
+              </w:rPr>
+              <w:t xml:space="preserve">El LED dentro, separado de la cámara y en oblicuo; </w:t>
+            </w:r>
+            <w:r>
+              <w:rPr>
+                <w:b/>
+                <w:i w:val="0"/>
+                <w:color w:val="0B0B0B"/>
+                <w:sz w:val="18"/>
+              </w:rPr>
+              <w:t>la batería de 9 V, fuera de la tolva</w:t>
+            </w:r>
+            <w:r>
+              <w:rPr>
+                <w:b w:val="0"/>
+                <w:i w:val="0"/>
+                <w:color w:val="0B0B0B"/>
+                <w:sz w:val="18"/>
+              </w:rPr>
+              <w:t xml:space="preserve"> (§3.6)</w:t>
             </w:r>
           </w:p>
         </w:tc>
@@ -5365,7 +7147,7 @@
       <w:r>
         <w:drawing>
           <wp:inline xmlns:a="http://schemas.openxmlformats.org/drawingml/2006/main" xmlns:pic="http://schemas.openxmlformats.org/drawingml/2006/picture">
-            <wp:extent cx="6120000" cy="4506848"/>
+            <wp:extent cx="6120000" cy="6188958"/>
             <wp:docPr id="4" name="Picture 4"/>
             <wp:cNvGraphicFramePr>
               <a:graphicFrameLocks noChangeAspect="1"/>
@@ -5386,7 +7168,7 @@
                   <pic:spPr>
                     <a:xfrm>
                       <a:off x="0" y="0"/>
-                      <a:ext cx="6120000" cy="4506848"/>
+                      <a:ext cx="6120000" cy="6188958"/>
                     </a:xfrm>
                     <a:prstGeom prst="rect"/>
                   </pic:spPr>
@@ -5669,7 +7451,7 @@
                 <w:color w:val="0B0B0B"/>
                 <w:sz w:val="18"/>
               </w:rPr>
-              <w:t xml:space="preserve">El ESP32-S3 </w:t>
+              <w:t xml:space="preserve">Ni el ESP32-S3 ni el ESP32-C6 </w:t>
             </w:r>
             <w:r>
               <w:rPr>
@@ -5678,7 +7460,7 @@
                 <w:color w:val="0B0B0B"/>
                 <w:sz w:val="18"/>
               </w:rPr>
-              <w:t>no tiene radio de 5 GHz</w:t>
+              <w:t>tienen radio de 5 GHz</w:t>
             </w:r>
             <w:r>
               <w:rPr>
@@ -8714,6 +10496,54 @@
     <w:p>
       <w:r>
         <w:rPr>
+          <w:rFonts w:ascii="Consolas" w:hAnsi="Consolas"/>
+          <w:b/>
+          <w:i w:val="0"/>
+          <w:color w:val="8B2E2E"/>
+          <w:sz w:val="19"/>
+        </w:rPr>
+        <w:t>session_id</w:t>
+      </w:r>
+      <w:r>
+        <w:rPr>
+          <w:b/>
+          <w:i w:val="0"/>
+          <w:color w:val="0B0B0B"/>
+          <w:sz w:val="21"/>
+        </w:rPr>
+        <w:t xml:space="preserve"> no sirve para agrupar el dataset.</w:t>
+      </w:r>
+      <w:r>
+        <w:rPr>
+          <w:b w:val="0"/>
+          <w:i w:val="0"/>
+          <w:color w:val="0B0B0B"/>
+          <w:sz w:val="21"/>
+        </w:rPr>
+        <w:t xml:space="preserve"> Si la central se reinicia a mitad de jornada —al cambiar el paquete de baterías, por ejemplo— abre una sesión nueva, y esa jornada quedaría partida en dos. Por eso la división en entrenamiento, validación y prueba se agrupa por </w:t>
+      </w:r>
+      <w:r>
+        <w:rPr>
+          <w:b/>
+          <w:i w:val="0"/>
+          <w:color w:val="0B0B0B"/>
+          <w:sz w:val="21"/>
+        </w:rPr>
+        <w:t>fecha de la jornada</w:t>
+      </w:r>
+      <w:r>
+        <w:rPr>
+          <w:b w:val="0"/>
+          <w:i w:val="0"/>
+          <w:color w:val="0B0B0B"/>
+          <w:sz w:val="21"/>
+        </w:rPr>
+        <w:t xml:space="preserve"> y no por sesión (manual de campo, §5).</w:t>
+      </w:r>
+    </w:p>
+    <w:p>
+      <w:r>
+        <w:rPr>
           <w:b/>
           <w:i w:val="0"/>
           <w:color w:val="0B0B0B"/>
@@ -9527,7 +11357,7 @@
                 <w:color w:val="0B0B0B"/>
                 <w:sz w:val="18"/>
               </w:rPr>
-              <w:t>Trama del A02YYUW, validada</w:t>
+              <w:t>Duración del eco del RCWL-1655 × velocidad del sonido / 2</w:t>
             </w:r>
           </w:p>
         </w:tc>
@@ -9680,6 +11510,54 @@
           <w:sz w:val="21"/>
         </w:rPr>
         <w:t xml:space="preserve"> Si dentro de tres meses se corrige la circunferencia efectiva de la rueda, con los pulsos guardados la velocidad de toda la campaña se recalcula. Sin ellos, hay que repetir la campaña. Los pulsos son el dato; las RPM son una interpretación del dato.</w:t>
+      </w:r>
+    </w:p>
+    <w:p>
+      <w:r>
+        <w:rPr>
+          <w:rFonts w:ascii="Consolas" w:hAnsi="Consolas"/>
+          <w:b/>
+          <w:i w:val="0"/>
+          <w:color w:val="8B2E2E"/>
+          <w:sz w:val="19"/>
+        </w:rPr>
+        <w:t>wheel_speed</w:t>
+      </w:r>
+      <w:r>
+        <w:rPr>
+          <w:b/>
+          <w:i w:val="0"/>
+          <w:color w:val="0B0B0B"/>
+          <w:sz w:val="21"/>
+        </w:rPr>
+        <w:t xml:space="preserve"> es una estimación, y hay que decirlo así.</w:t>
+      </w:r>
+      <w:r>
+        <w:rPr>
+          <w:b w:val="0"/>
+          <w:i w:val="0"/>
+          <w:color w:val="0B0B0B"/>
+          <w:sz w:val="21"/>
+        </w:rPr>
+        <w:t xml:space="preserve"> La rueda patina, se hunde y deforma el neumático, y esos efectos cambian a lo largo de la jornada —con la humedad del suelo, los giros y el peso, que aumenta con cada tolvada—. Medir la circunferencia efectiva en campo y con carga corrige el valor medio, pero no la variación. No se instala GNSS, así que no hay una referencia independiente con la que contrastarla: la velocidad, y con ella el </w:t>
+      </w:r>
+      <w:r>
+        <w:rPr>
+          <w:b w:val="0"/>
+          <w:i/>
+          <w:color w:val="0B0B0B"/>
+          <w:sz w:val="21"/>
+        </w:rPr>
+        <w:t>reel index</w:t>
+      </w:r>
+      <w:r>
+        <w:rPr>
+          <w:b w:val="0"/>
+          <w:i w:val="0"/>
+          <w:color w:val="0B0B0B"/>
+          <w:sz w:val="21"/>
+        </w:rPr>
+        <w:t>, se publican como magnitudes estimadas y se analizan por tramos, no por valores puntuales.</w:t>
       </w:r>
     </w:p>
     <w:p>
@@ -10193,7 +12071,7 @@
                 <w:color w:val="0B0B0B"/>
                 <w:sz w:val="18"/>
               </w:rPr>
-              <w:t>La trama UART no superó la verificación</w:t>
+              <w:t>Solo para un sensor de trama serie (el A02YYUW de la versión 1.1); el RCWL-1655 no lo produce</w:t>
             </w:r>
           </w:p>
         </w:tc>
@@ -10256,7 +12134,26 @@
                 <w:color w:val="0B0B0B"/>
                 <w:sz w:val="18"/>
               </w:rPr>
-              <w:t>No llegó trama dentro del plazo</w:t>
+              <w:t>No llegó eco dentro del plazo (</w:t>
+            </w:r>
+            <w:r>
+              <w:rPr>
+                <w:rFonts w:ascii="Consolas" w:hAnsi="Consolas"/>
+                <w:b w:val="0"/>
+                <w:i w:val="0"/>
+                <w:color w:val="8B2E2E"/>
+                <w:sz w:val="16"/>
+              </w:rPr>
+              <w:t>timeout_eco_us</w:t>
+            </w:r>
+            <w:r>
+              <w:rPr>
+                <w:b w:val="0"/>
+                <w:i w:val="0"/>
+                <w:color w:val="0B0B0B"/>
+                <w:sz w:val="18"/>
+              </w:rPr>
+              <w:t>)</w:t>
             </w:r>
           </w:p>
         </w:tc>
@@ -13391,7 +15288,55 @@
           <w:color w:val="0B0B0B"/>
           <w:sz w:val="21"/>
         </w:rPr>
-        <w:t xml:space="preserve"> Medido sobre Raspberry Pi 5 con YOLO11n a 640 × 640: NCNN 93,9 ms, ONNX 181,8 ms, TensorFlow Lite 324,2 ms, PyTorch 524,8 ms. Más de cinco veces de diferencia, sin coste.</w:t>
+        <w:t xml:space="preserve"> Sobre Raspberry Pi 5 con YOLO11n a 640 × 640: NCNN 93,9 ms, ONNX 181,8 ms, TensorFlow Lite 324,2 ms, PyTorch 524,8 ms. Más de cinco veces de diferencia, sin coste. Las cifras proceden de la guía de Raspberry Pi de Ultralytics y hay que citarlas con su fecha de consulta, porque la tabla cambia con cada versión. Son además de </w:t>
+      </w:r>
+      <w:r>
+        <w:rPr>
+          <w:b/>
+          <w:i w:val="0"/>
+          <w:color w:val="0B0B0B"/>
+          <w:sz w:val="21"/>
+        </w:rPr>
+        <w:t>detección</w:t>
+      </w:r>
+      <w:r>
+        <w:rPr>
+          <w:b w:val="0"/>
+          <w:i w:val="0"/>
+          <w:color w:val="0B0B0B"/>
+          <w:sz w:val="21"/>
+        </w:rPr>
+        <w:t>: la clasificación de acame y las dos segmentaciones tendrán su propio coste, que habrá que medir en la Pi real (§10).</w:t>
+      </w:r>
+    </w:p>
+    <w:p>
+      <w:r>
+        <w:rPr>
+          <w:b w:val="0"/>
+          <w:i w:val="0"/>
+          <w:color w:val="0B0B0B"/>
+          <w:sz w:val="21"/>
+        </w:rPr>
+        <w:t xml:space="preserve">La trilla no está en esta tabla porque queda fuera del alcance actual. Si más adelante se entrena, saldría de las mismas fotos de </w:t>
+      </w:r>
+      <w:r>
+        <w:rPr>
+          <w:rFonts w:ascii="Consolas" w:hAnsi="Consolas"/>
+          <w:b w:val="0"/>
+          <w:i w:val="0"/>
+          <w:color w:val="8B2E2E"/>
+          <w:sz w:val="19"/>
+        </w:rPr>
+        <w:t>CAM04</w:t>
+      </w:r>
+      <w:r>
+        <w:rPr>
+          <w:b w:val="0"/>
+          <w:i w:val="0"/>
+          <w:color w:val="0B0B0B"/>
+          <w:sz w:val="21"/>
+        </w:rPr>
+        <w:t xml:space="preserve"> con una clase de grano partido, sin cámara nueva.</w:t>
       </w:r>
     </w:p>
     <w:p>
@@ -14415,7 +16360,7 @@
           <w:color w:val="0B0B0B"/>
           <w:sz w:val="21"/>
         </w:rPr>
-        <w:t xml:space="preserve">Precios de referencia en dólares, </w:t>
+        <w:t xml:space="preserve">Precios de referencia en dólares de septiembre de 2026, </w:t>
       </w:r>
       <w:r>
         <w:rPr>
@@ -14433,7 +16378,43 @@
           <w:color w:val="0B0B0B"/>
           <w:sz w:val="21"/>
         </w:rPr>
-        <w:t>, sin aranceles ni IVA.</w:t>
+        <w:t xml:space="preserve">, sin aranceles ni IVA. Los ítems que cambiaron en octubre llevan el precio en pesos de la cotización del equipo cuando se conoce; los que no, se marcan </w:t>
+      </w:r>
+      <w:r>
+        <w:rPr>
+          <w:b w:val="0"/>
+          <w:i/>
+          <w:color w:val="0B0B0B"/>
+          <w:sz w:val="21"/>
+        </w:rPr>
+        <w:t>por confirmar</w:t>
+      </w:r>
+      <w:r>
+        <w:rPr>
+          <w:b w:val="0"/>
+          <w:i w:val="0"/>
+          <w:color w:val="0B0B0B"/>
+          <w:sz w:val="21"/>
+        </w:rPr>
+        <w:t xml:space="preserve">. </w:t>
+      </w:r>
+      <w:r>
+        <w:rPr>
+          <w:b/>
+          <w:i w:val="0"/>
+          <w:color w:val="0B0B0B"/>
+          <w:sz w:val="21"/>
+        </w:rPr>
+        <w:t>El total hay que recalcularlo</w:t>
+      </w:r>
+      <w:r>
+        <w:rPr>
+          <w:b w:val="0"/>
+          <w:i w:val="0"/>
+          <w:color w:val="0B0B0B"/>
+          <w:sz w:val="21"/>
+        </w:rPr>
+        <w:t xml:space="preserve"> con la cotización.</w:t>
       </w:r>
     </w:p>
     <w:p>
@@ -14689,7 +16670,7 @@
                 <w:color w:val="0B0B0B"/>
                 <w:sz w:val="18"/>
               </w:rPr>
-              <w:t>M.2 HAT+ para NVMe</w:t>
+              <w:t>HAT M.2 para NVMe (GeekPi N04)</w:t>
             </w:r>
           </w:p>
         </w:tc>
@@ -14751,7 +16732,7 @@
                 <w:color w:val="0B0B0B"/>
                 <w:sz w:val="18"/>
               </w:rPr>
-              <w:t>SSD NVMe 512 GB</w:t>
+              <w:t>SSD NVMe 128 GB</w:t>
             </w:r>
           </w:p>
         </w:tc>
@@ -14767,11 +16748,11 @@
             <w:r>
               <w:rPr>
                 <w:b w:val="0"/>
-                <w:i w:val="0"/>
-                <w:color w:val="0B0B0B"/>
-                <w:sz w:val="18"/>
-              </w:rPr>
-              <w:t>US$ 45</w:t>
+                <w:i/>
+                <w:color w:val="0B0B0B"/>
+                <w:sz w:val="18"/>
+              </w:rPr>
+              <w:t>por confirmar</w:t>
             </w:r>
           </w:p>
         </w:tc>
@@ -14813,7 +16794,7 @@
                 <w:color w:val="0B0B0B"/>
                 <w:sz w:val="18"/>
               </w:rPr>
-              <w:t>Batería de RTC</w:t>
+              <w:t>Portapilas y pila CR2032 para el RTC</w:t>
             </w:r>
           </w:p>
         </w:tc>
@@ -14875,7 +16856,7 @@
                 <w:color w:val="0B0B0B"/>
                 <w:sz w:val="18"/>
               </w:rPr>
-              <w:t>microSD de emergencia con el sistema</w:t>
+              <w:t>microSD de 64 GB con el sistema, como copia de rescate</w:t>
             </w:r>
           </w:p>
         </w:tc>
@@ -14958,59 +16939,6 @@
                 <w:sz w:val="18"/>
               </w:rPr>
               <w:t>US$ 25</w:t>
-            </w:r>
-          </w:p>
-        </w:tc>
-      </w:tr>
-      <w:tr>
-        <w:tc>
-          <w:tcPr>
-            <w:tcW w:type="dxa" w:w="3213"/>
-          </w:tcPr>
-          <w:p>
-            <w:pPr>
-              <w:spacing w:after="40" w:before="40"/>
-            </w:pPr>
-            <w:r/>
-          </w:p>
-        </w:tc>
-        <w:tc>
-          <w:tcPr>
-            <w:tcW w:type="dxa" w:w="3213"/>
-          </w:tcPr>
-          <w:p>
-            <w:pPr>
-              <w:spacing w:after="40" w:before="40"/>
-            </w:pPr>
-            <w:r/>
-            <w:r>
-              <w:rPr>
-                <w:b/>
-                <w:i w:val="0"/>
-                <w:color w:val="0B0B0B"/>
-                <w:sz w:val="18"/>
-              </w:rPr>
-              <w:t>Subtotal</w:t>
-            </w:r>
-          </w:p>
-        </w:tc>
-        <w:tc>
-          <w:tcPr>
-            <w:tcW w:type="dxa" w:w="3213"/>
-          </w:tcPr>
-          <w:p>
-            <w:pPr>
-              <w:spacing w:after="40" w:before="40"/>
-            </w:pPr>
-            <w:r/>
-            <w:r>
-              <w:rPr>
-                <w:b/>
-                <w:i w:val="0"/>
-                <w:color w:val="0B0B0B"/>
-                <w:sz w:val="18"/>
-              </w:rPr>
-              <w:t>US$ 183</w:t>
             </w:r>
           </w:p>
         </w:tc>
@@ -15130,7 +17058,7 @@
                 <w:color w:val="0B0B0B"/>
                 <w:sz w:val="18"/>
               </w:rPr>
-              <w:t>2 paq.</w:t>
+              <w:t>4</w:t>
             </w:r>
           </w:p>
         </w:tc>
@@ -15150,7 +17078,7 @@
                 <w:color w:val="0B0B0B"/>
                 <w:sz w:val="18"/>
               </w:rPr>
-              <w:t>3 × ESP32-S3-CAM con OV3660</w:t>
+              <w:t>GOOUUU ESP32-S3-CAM V1.5 (N16R8) con OV3660</w:t>
             </w:r>
           </w:p>
         </w:tc>
@@ -15170,7 +17098,7 @@
                 <w:color w:val="0B0B0B"/>
                 <w:sz w:val="18"/>
               </w:rPr>
-              <w:t>US$ 70</w:t>
+              <w:t>US$ 70 (dos paquetes de 3)</w:t>
             </w:r>
           </w:p>
         </w:tc>
@@ -15192,7 +17120,7 @@
                 <w:color w:val="0B0B0B"/>
                 <w:sz w:val="18"/>
               </w:rPr>
-              <w:t>2 paq.</w:t>
+              <w:t>4</w:t>
             </w:r>
           </w:p>
         </w:tc>
@@ -15212,7 +17140,7 @@
                 <w:color w:val="0B0B0B"/>
                 <w:sz w:val="18"/>
               </w:rPr>
-              <w:t>3 × ESP32-S3 N16R8</w:t>
+              <w:t>ESP32-C6 DevKitC</w:t>
             </w:r>
           </w:p>
         </w:tc>
@@ -15228,11 +17156,11 @@
             <w:r>
               <w:rPr>
                 <w:b w:val="0"/>
-                <w:i w:val="0"/>
-                <w:color w:val="0B0B0B"/>
-                <w:sz w:val="18"/>
-              </w:rPr>
-              <w:t>US$ 38</w:t>
+                <w:i/>
+                <w:color w:val="0B0B0B"/>
+                <w:sz w:val="18"/>
+              </w:rPr>
+              <w:t>por confirmar</w:t>
             </w:r>
           </w:p>
         </w:tc>
@@ -15336,7 +17264,7 @@
                 <w:color w:val="0B0B0B"/>
                 <w:sz w:val="18"/>
               </w:rPr>
-              <w:t>Ultrasónico A02YYUW</w:t>
+              <w:t>Ultrasónico RCWL-1655</w:t>
             </w:r>
           </w:p>
         </w:tc>
@@ -15352,11 +17280,11 @@
             <w:r>
               <w:rPr>
                 <w:b w:val="0"/>
-                <w:i w:val="0"/>
-                <w:color w:val="0B0B0B"/>
-                <w:sz w:val="18"/>
-              </w:rPr>
-              <w:t>US$ 48</w:t>
+                <w:i/>
+                <w:color w:val="0B0B0B"/>
+                <w:sz w:val="18"/>
+              </w:rPr>
+              <w:t>por confirmar</w:t>
             </w:r>
           </w:p>
         </w:tc>
@@ -15398,7 +17326,7 @@
                 <w:color w:val="0B0B0B"/>
                 <w:sz w:val="18"/>
               </w:rPr>
-              <w:t>Sensor Hall + imanes</w:t>
+              <w:t>Módulo Hall HW-477 (A3144) + imanes</w:t>
             </w:r>
           </w:p>
         </w:tc>
@@ -15435,12 +17363,12 @@
             <w:r/>
             <w:r>
               <w:rPr>
-                <w:b/>
-                <w:i w:val="0"/>
-                <w:color w:val="0B0B0B"/>
-                <w:sz w:val="18"/>
-              </w:rPr>
-              <w:t>32</w:t>
+                <w:b w:val="0"/>
+                <w:i w:val="0"/>
+                <w:color w:val="0B0B0B"/>
+                <w:sz w:val="18"/>
+              </w:rPr>
+              <w:t>8</w:t>
             </w:r>
           </w:p>
         </w:tc>
@@ -15455,12 +17383,12 @@
             <w:r/>
             <w:r>
               <w:rPr>
-                <w:b/>
-                <w:i w:val="0"/>
-                <w:color w:val="0B0B0B"/>
-                <w:sz w:val="18"/>
-              </w:rPr>
-              <w:t>Celda 18650 3000 mAh protegida</w:t>
+                <w:b w:val="0"/>
+                <w:i w:val="0"/>
+                <w:color w:val="0B0B0B"/>
+                <w:sz w:val="18"/>
+              </w:rPr>
+              <w:t>Kit de 4 pilas AA Ni-MH + cargador</w:t>
             </w:r>
           </w:p>
         </w:tc>
@@ -15475,12 +17403,12 @@
             <w:r/>
             <w:r>
               <w:rPr>
-                <w:b/>
-                <w:i w:val="0"/>
-                <w:color w:val="0B0B0B"/>
-                <w:sz w:val="18"/>
-              </w:rPr>
-              <w:t>US$ 160</w:t>
+                <w:b w:val="0"/>
+                <w:i/>
+                <w:color w:val="0B0B0B"/>
+                <w:sz w:val="18"/>
+              </w:rPr>
+              <w:t>por confirmar</w:t>
             </w:r>
           </w:p>
         </w:tc>
@@ -15497,12 +17425,12 @@
             <w:r/>
             <w:r>
               <w:rPr>
-                <w:b/>
-                <w:i w:val="0"/>
-                <w:color w:val="0B0B0B"/>
-                <w:sz w:val="18"/>
-              </w:rPr>
-              <w:t>16</w:t>
+                <w:b w:val="0"/>
+                <w:i w:val="0"/>
+                <w:color w:val="0B0B0B"/>
+                <w:sz w:val="18"/>
+              </w:rPr>
+              <w:t>8</w:t>
             </w:r>
           </w:p>
         </w:tc>
@@ -15517,12 +17445,12 @@
             <w:r/>
             <w:r>
               <w:rPr>
-                <w:b/>
-                <w:i w:val="0"/>
-                <w:color w:val="0B0B0B"/>
-                <w:sz w:val="18"/>
-              </w:rPr>
-              <w:t>Portapilas 2×18650 + protección 1S</w:t>
+                <w:b w:val="0"/>
+                <w:i w:val="0"/>
+                <w:color w:val="0B0B0B"/>
+                <w:sz w:val="18"/>
+              </w:rPr>
+              <w:t>Portapilas de 4 AA + fusible de 1 A + interruptor</w:t>
             </w:r>
           </w:p>
         </w:tc>
@@ -15537,12 +17465,12 @@
             <w:r/>
             <w:r>
               <w:rPr>
-                <w:b/>
-                <w:i w:val="0"/>
-                <w:color w:val="0B0B0B"/>
-                <w:sz w:val="18"/>
-              </w:rPr>
-              <w:t>US$ 48</w:t>
+                <w:b w:val="0"/>
+                <w:i/>
+                <w:color w:val="0B0B0B"/>
+                <w:sz w:val="18"/>
+              </w:rPr>
+              <w:t>por confirmar</w:t>
             </w:r>
           </w:p>
         </w:tc>
@@ -15559,12 +17487,12 @@
             <w:r/>
             <w:r>
               <w:rPr>
-                <w:b/>
-                <w:i w:val="0"/>
-                <w:color w:val="0B0B0B"/>
-                <w:sz w:val="18"/>
-              </w:rPr>
-              <w:t>8</w:t>
+                <w:b w:val="0"/>
+                <w:i w:val="0"/>
+                <w:color w:val="0B0B0B"/>
+                <w:sz w:val="18"/>
+              </w:rPr>
+              <w:t>—</w:t>
             </w:r>
           </w:p>
         </w:tc>
@@ -15579,12 +17507,12 @@
             <w:r/>
             <w:r>
               <w:rPr>
-                <w:b/>
-                <w:i w:val="0"/>
-                <w:color w:val="0B0B0B"/>
-                <w:sz w:val="18"/>
-              </w:rPr>
-              <w:t>Elevador a 5 V</w:t>
+                <w:b w:val="0"/>
+                <w:i w:val="0"/>
+                <w:color w:val="0B0B0B"/>
+                <w:sz w:val="18"/>
+              </w:rPr>
+              <w:t>Diodos 1N5819, resistencias de 10 kΩ, 150 kΩ y 100 kΩ, condensadores de 100 nF</w:t>
             </w:r>
           </w:p>
         </w:tc>
@@ -15599,12 +17527,12 @@
             <w:r/>
             <w:r>
               <w:rPr>
-                <w:b/>
-                <w:i w:val="0"/>
-                <w:color w:val="0B0B0B"/>
-                <w:sz w:val="18"/>
-              </w:rPr>
-              <w:t>US$ 24</w:t>
+                <w:b w:val="0"/>
+                <w:i/>
+                <w:color w:val="0B0B0B"/>
+                <w:sz w:val="18"/>
+              </w:rPr>
+              <w:t>por confirmar</w:t>
             </w:r>
           </w:p>
         </w:tc>
@@ -15626,7 +17554,7 @@
                 <w:color w:val="0B0B0B"/>
                 <w:sz w:val="18"/>
               </w:rPr>
-              <w:t>1</w:t>
+              <w:t>8</w:t>
             </w:r>
           </w:p>
         </w:tc>
@@ -15646,7 +17574,7 @@
                 <w:color w:val="0B0B0B"/>
                 <w:sz w:val="18"/>
               </w:rPr>
-              <w:t>Cargador de bahía para 18650</w:t>
+              <w:t>Caja IP65 con prensaestopas</w:t>
             </w:r>
           </w:p>
         </w:tc>
@@ -15666,7 +17594,7 @@
                 <w:color w:val="0B0B0B"/>
                 <w:sz w:val="18"/>
               </w:rPr>
-              <w:t>US$ 25</w:t>
+              <w:t>US$ 56</w:t>
             </w:r>
           </w:p>
         </w:tc>
@@ -15688,7 +17616,7 @@
                 <w:color w:val="0B0B0B"/>
                 <w:sz w:val="18"/>
               </w:rPr>
-              <w:t>5</w:t>
+              <w:t>1</w:t>
             </w:r>
           </w:p>
         </w:tc>
@@ -15708,7 +17636,7 @@
                 <w:color w:val="0B0B0B"/>
                 <w:sz w:val="18"/>
               </w:rPr>
-              <w:t>microSD 32 GB</w:t>
+              <w:t>Módulo LED de inyección de 12 V + referencia de color</w:t>
             </w:r>
           </w:p>
         </w:tc>
@@ -15728,7 +17656,7 @@
                 <w:color w:val="0B0B0B"/>
                 <w:sz w:val="18"/>
               </w:rPr>
-              <w:t>US$ 40</w:t>
+              <w:t>US$ 20</w:t>
             </w:r>
           </w:p>
         </w:tc>
@@ -15750,7 +17678,7 @@
                 <w:color w:val="0B0B0B"/>
                 <w:sz w:val="18"/>
               </w:rPr>
-              <w:t>8</w:t>
+              <w:t>1</w:t>
             </w:r>
           </w:p>
         </w:tc>
@@ -15770,7 +17698,7 @@
                 <w:color w:val="0B0B0B"/>
                 <w:sz w:val="18"/>
               </w:rPr>
-              <w:t>Caja IP65 con prensaestopas</w:t>
+              <w:t>MOSFET IRLZ44N, resistencias de 200 Ω y 100 kΩ, fusible de 1 A</w:t>
             </w:r>
           </w:p>
         </w:tc>
@@ -15790,7 +17718,7 @@
                 <w:color w:val="0B0B0B"/>
                 <w:sz w:val="18"/>
               </w:rPr>
-              <w:t>US$ 56</w:t>
+              <w:t>US$ 10</w:t>
             </w:r>
           </w:p>
         </w:tc>
@@ -15832,7 +17760,7 @@
                 <w:color w:val="0B0B0B"/>
                 <w:sz w:val="18"/>
               </w:rPr>
-              <w:t>Iluminación LED de tolva + referencia de color</w:t>
+              <w:t>Batería recargable de 9 V (PP3, 250 mAh) + cargador</w:t>
             </w:r>
           </w:p>
         </w:tc>
@@ -15848,11 +17776,11 @@
             <w:r>
               <w:rPr>
                 <w:b w:val="0"/>
-                <w:i w:val="0"/>
-                <w:color w:val="0B0B0B"/>
-                <w:sz w:val="18"/>
-              </w:rPr>
-              <w:t>US$ 20</w:t>
+                <w:i/>
+                <w:color w:val="0B0B0B"/>
+                <w:sz w:val="18"/>
+              </w:rPr>
+              <w:t>por confirmar</w:t>
             </w:r>
           </w:p>
         </w:tc>
@@ -15915,59 +17843,6 @@
                 <w:sz w:val="18"/>
               </w:rPr>
               <w:t>US$ 60</w:t>
-            </w:r>
-          </w:p>
-        </w:tc>
-      </w:tr>
-      <w:tr>
-        <w:tc>
-          <w:tcPr>
-            <w:tcW w:type="dxa" w:w="3213"/>
-          </w:tcPr>
-          <w:p>
-            <w:pPr>
-              <w:spacing w:after="40" w:before="40"/>
-            </w:pPr>
-            <w:r/>
-          </w:p>
-        </w:tc>
-        <w:tc>
-          <w:tcPr>
-            <w:tcW w:type="dxa" w:w="3213"/>
-          </w:tcPr>
-          <w:p>
-            <w:pPr>
-              <w:spacing w:after="40" w:before="40"/>
-            </w:pPr>
-            <w:r/>
-            <w:r>
-              <w:rPr>
-                <w:b/>
-                <w:i w:val="0"/>
-                <w:color w:val="0B0B0B"/>
-                <w:sz w:val="18"/>
-              </w:rPr>
-              <w:t>Subtotal</w:t>
-            </w:r>
-          </w:p>
-        </w:tc>
-        <w:tc>
-          <w:tcPr>
-            <w:tcW w:type="dxa" w:w="3213"/>
-          </w:tcPr>
-          <w:p>
-            <w:pPr>
-              <w:spacing w:after="40" w:before="40"/>
-            </w:pPr>
-            <w:r/>
-            <w:r>
-              <w:rPr>
-                <w:b/>
-                <w:i w:val="0"/>
-                <w:color w:val="0B0B0B"/>
-                <w:sz w:val="18"/>
-              </w:rPr>
-              <w:t>US$ 631</w:t>
             </w:r>
           </w:p>
         </w:tc>
@@ -15986,7 +17861,7 @@
           <w:color w:val="0B0B0B"/>
           <w:sz w:val="21"/>
         </w:rPr>
-        <w:t>32 celdas y no 16</w:t>
+        <w:t>Un juego de pilas por nodo.</w:t>
       </w:r>
       <w:r>
         <w:rPr>
@@ -15995,7 +17870,7 @@
           <w:color w:val="0B0B0B"/>
           <w:sz w:val="21"/>
         </w:rPr>
-        <w:t>: dos juegos completos de paquetes, uno montado y otro cargando. Es lo que permite trabajar dos jornadas seguidas sin esperar cargas.</w:t>
+        <w:t xml:space="preserve"> Con 32 pilas no hay recambio cargado: un segundo juego, para trabajar dos jornadas seguidas sin esperar cargas, serían otras 32.</w:t>
       </w:r>
     </w:p>
     <w:p>
@@ -16127,7 +18002,7 @@
                 <w:color w:val="0B0B0B"/>
                 <w:sz w:val="18"/>
               </w:rPr>
-              <w:t>Punto de acceso 2,4 GHz</w:t>
+              <w:t>Router Tenda N301 (2,4 GHz, 9 V)</w:t>
             </w:r>
           </w:p>
         </w:tc>
@@ -16147,7 +18022,7 @@
                 <w:color w:val="0B0B0B"/>
                 <w:sz w:val="18"/>
               </w:rPr>
-              <w:t>US$ 35</w:t>
+              <w:t>COP 41.000</w:t>
             </w:r>
           </w:p>
         </w:tc>
@@ -16251,7 +18126,7 @@
                 <w:color w:val="0B0B0B"/>
                 <w:sz w:val="18"/>
               </w:rPr>
-              <w:t>Cable Ethernet apantallado</w:t>
+              <w:t>Cable Ethernet apantallado, con par de alimentación</w:t>
             </w:r>
           </w:p>
         </w:tc>
@@ -16313,7 +18188,7 @@
                 <w:color w:val="0B0B0B"/>
                 <w:sz w:val="18"/>
               </w:rPr>
-              <w:t>DC-DC 12 V → 5 V, 6 A, para la Pi</w:t>
+              <w:t>Batería LiFePO4 12,8 V 12 Ah con BMS</w:t>
             </w:r>
           </w:p>
         </w:tc>
@@ -16333,7 +18208,7 @@
                 <w:color w:val="0B0B0B"/>
                 <w:sz w:val="18"/>
               </w:rPr>
-              <w:t>US$ 18</w:t>
+              <w:t>COP 212.518</w:t>
             </w:r>
           </w:p>
         </w:tc>
@@ -16375,7 +18250,7 @@
                 <w:color w:val="0B0B0B"/>
                 <w:sz w:val="18"/>
               </w:rPr>
-              <w:t>Optoacoplador y componentes de contacto</w:t>
+              <w:t>Cargador LiFePO4 14,6 V, 2 A</w:t>
             </w:r>
           </w:p>
         </w:tc>
@@ -16395,7 +18270,7 @@
                 <w:color w:val="0B0B0B"/>
                 <w:sz w:val="18"/>
               </w:rPr>
-              <w:t>US$ 5</w:t>
+              <w:t>COP 52.271</w:t>
             </w:r>
           </w:p>
         </w:tc>
@@ -16437,7 +18312,7 @@
                 <w:color w:val="0B0B0B"/>
                 <w:sz w:val="18"/>
               </w:rPr>
-              <w:t>Capacitancia, fusibles y protección</w:t>
+              <w:t>Convertidor 12 V → 5 V USB-C 5 A, para la Pi</w:t>
             </w:r>
           </w:p>
         </w:tc>
@@ -16457,7 +18332,7 @@
                 <w:color w:val="0B0B0B"/>
                 <w:sz w:val="18"/>
               </w:rPr>
-              <w:t>US$ 30</w:t>
+              <w:t>COP 29.388</w:t>
             </w:r>
           </w:p>
         </w:tc>
@@ -16472,6 +18347,15 @@
               <w:spacing w:after="40" w:before="40"/>
             </w:pPr>
             <w:r/>
+            <w:r>
+              <w:rPr>
+                <w:b w:val="0"/>
+                <w:i w:val="0"/>
+                <w:color w:val="0B0B0B"/>
+                <w:sz w:val="18"/>
+              </w:rPr>
+              <w:t>1</w:t>
+            </w:r>
           </w:p>
         </w:tc>
         <w:tc>
@@ -16485,12 +18369,12 @@
             <w:r/>
             <w:r>
               <w:rPr>
-                <w:b/>
-                <w:i w:val="0"/>
-                <w:color w:val="0B0B0B"/>
-                <w:sz w:val="18"/>
-              </w:rPr>
-              <w:t>Subtotal</w:t>
+                <w:b w:val="0"/>
+                <w:i w:val="0"/>
+                <w:color w:val="0B0B0B"/>
+                <w:sz w:val="18"/>
+              </w:rPr>
+              <w:t>Convertidor 12 V → 9 V 5 A con conector 5521, para el router</w:t>
             </w:r>
           </w:p>
         </w:tc>
@@ -16505,86 +18389,136 @@
             <w:r/>
             <w:r>
               <w:rPr>
-                <w:b/>
-                <w:i w:val="0"/>
-                <w:color w:val="0B0B0B"/>
-                <w:sz w:val="18"/>
-              </w:rPr>
-              <w:t>US$ 115</w:t>
+                <w:b w:val="0"/>
+                <w:i w:val="0"/>
+                <w:color w:val="0B0B0B"/>
+                <w:sz w:val="18"/>
+              </w:rPr>
+              <w:t>COP 39.195</w:t>
             </w:r>
           </w:p>
         </w:tc>
       </w:tr>
-    </w:tbl>
-    <w:p>
-      <w:pPr>
-        <w:spacing w:after="80"/>
-      </w:pPr>
-    </w:p>
-    <w:tbl>
-      <w:tblPr>
-        <w:tblStyle w:val="TableGrid"/>
-        <w:tblW w:type="auto" w:w="0"/>
-        <w:jc w:val="center"/>
-        <w:tblLook w:firstColumn="1" w:firstRow="1" w:lastColumn="0" w:lastRow="0" w:noHBand="0" w:noVBand="1" w:val="04A0"/>
-      </w:tblPr>
-      <w:tblGrid>
-        <w:gridCol w:w="3213"/>
-        <w:gridCol w:w="3213"/>
-        <w:gridCol w:w="3213"/>
-      </w:tblGrid>
       <w:tr>
         <w:tc>
           <w:tcPr>
             <w:tcW w:type="dxa" w:w="3213"/>
-            <w:shd w:val="clear" w:color="auto" w:fill="E8EDF6"/>
-          </w:tcPr>
-          <w:p>
-            <w:pPr>
-              <w:spacing w:after="40" w:before="40"/>
-            </w:pPr>
-            <w:r/>
+          </w:tcPr>
+          <w:p>
+            <w:pPr>
+              <w:spacing w:after="40" w:before="40"/>
+            </w:pPr>
+            <w:r/>
+            <w:r>
+              <w:rPr>
+                <w:b w:val="0"/>
+                <w:i w:val="0"/>
+                <w:color w:val="0B0B0B"/>
+                <w:sz w:val="18"/>
+              </w:rPr>
+              <w:t>1</w:t>
+            </w:r>
           </w:p>
         </w:tc>
         <w:tc>
           <w:tcPr>
             <w:tcW w:type="dxa" w:w="3213"/>
-            <w:shd w:val="clear" w:color="auto" w:fill="E8EDF6"/>
-          </w:tcPr>
-          <w:p>
-            <w:pPr>
-              <w:spacing w:after="40" w:before="40"/>
-            </w:pPr>
-            <w:r/>
-            <w:r>
-              <w:rPr>
-                <w:b/>
-                <w:i w:val="0"/>
-                <w:color w:val="0B0B0B"/>
-                <w:sz w:val="18"/>
-              </w:rPr>
-              <w:t>Total estimado de hardware</w:t>
+          </w:tcPr>
+          <w:p>
+            <w:pPr>
+              <w:spacing w:after="40" w:before="40"/>
+            </w:pPr>
+            <w:r/>
+            <w:r>
+              <w:rPr>
+                <w:b w:val="0"/>
+                <w:i w:val="0"/>
+                <w:color w:val="0B0B0B"/>
+                <w:sz w:val="18"/>
+              </w:rPr>
+              <w:t>Portafusibles con fusibles de 3 a 15 A</w:t>
             </w:r>
           </w:p>
         </w:tc>
         <w:tc>
           <w:tcPr>
             <w:tcW w:type="dxa" w:w="3213"/>
-            <w:shd w:val="clear" w:color="auto" w:fill="E8EDF6"/>
-          </w:tcPr>
-          <w:p>
-            <w:pPr>
-              <w:spacing w:after="40" w:before="40"/>
-            </w:pPr>
-            <w:r/>
-            <w:r>
-              <w:rPr>
-                <w:b/>
-                <w:i w:val="0"/>
-                <w:color w:val="0B0B0B"/>
-                <w:sz w:val="18"/>
-              </w:rPr>
-              <w:t>≈ US$ 930</w:t>
+          </w:tcPr>
+          <w:p>
+            <w:pPr>
+              <w:spacing w:after="40" w:before="40"/>
+            </w:pPr>
+            <w:r/>
+            <w:r>
+              <w:rPr>
+                <w:b w:val="0"/>
+                <w:i/>
+                <w:color w:val="0B0B0B"/>
+                <w:sz w:val="18"/>
+              </w:rPr>
+              <w:t>por confirmar</w:t>
+            </w:r>
+          </w:p>
+        </w:tc>
+      </w:tr>
+      <w:tr>
+        <w:tc>
+          <w:tcPr>
+            <w:tcW w:type="dxa" w:w="3213"/>
+          </w:tcPr>
+          <w:p>
+            <w:pPr>
+              <w:spacing w:after="40" w:before="40"/>
+            </w:pPr>
+            <w:r/>
+            <w:r>
+              <w:rPr>
+                <w:b w:val="0"/>
+                <w:i w:val="0"/>
+                <w:color w:val="0B0B0B"/>
+                <w:sz w:val="18"/>
+              </w:rPr>
+              <w:t>1</w:t>
+            </w:r>
+          </w:p>
+        </w:tc>
+        <w:tc>
+          <w:tcPr>
+            <w:tcW w:type="dxa" w:w="3213"/>
+          </w:tcPr>
+          <w:p>
+            <w:pPr>
+              <w:spacing w:after="40" w:before="40"/>
+            </w:pPr>
+            <w:r/>
+            <w:r>
+              <w:rPr>
+                <w:b w:val="0"/>
+                <w:i w:val="0"/>
+                <w:color w:val="0B0B0B"/>
+                <w:sz w:val="18"/>
+              </w:rPr>
+              <w:t>Capacitancia y protección</w:t>
+            </w:r>
+          </w:p>
+        </w:tc>
+        <w:tc>
+          <w:tcPr>
+            <w:tcW w:type="dxa" w:w="3213"/>
+          </w:tcPr>
+          <w:p>
+            <w:pPr>
+              <w:spacing w:after="40" w:before="40"/>
+            </w:pPr>
+            <w:r/>
+            <w:r>
+              <w:rPr>
+                <w:b w:val="0"/>
+                <w:i w:val="0"/>
+                <w:color w:val="0B0B0B"/>
+                <w:sz w:val="18"/>
+              </w:rPr>
+              <w:t>US$ 30</w:t>
             </w:r>
           </w:p>
         </w:tc>
@@ -16604,6 +18538,26 @@
           <w:sz w:val="21"/>
         </w:rPr>
         <w:t>Sin servicio de nube recurrente: la inferencia es local.</w:t>
+      </w:r>
+    </w:p>
+    <w:p>
+      <w:r>
+        <w:rPr>
+          <w:b/>
+          <w:i w:val="0"/>
+          <w:color w:val="0B0B0B"/>
+          <w:sz w:val="21"/>
+        </w:rPr>
+        <w:t>Por qué una batería de 12 Ah.</w:t>
+      </w:r>
+      <w:r>
+        <w:rPr>
+          <w:b w:val="0"/>
+          <w:i w:val="0"/>
+          <w:color w:val="0B0B0B"/>
+          <w:sz w:val="21"/>
+        </w:rPr>
+        <w:t xml:space="preserve"> Con la Pi y el router en fase de dataset el sistema de cabina gasta del orden de 11 W en batería; unos 150 Wh dan unas doce horas. La de 7 Ah se descartó porque no llegaba a una jornada.</w:t>
       </w:r>
     </w:p>
     <w:p>
@@ -17079,7 +19033,7 @@
           <w:color w:val="0B0B0B"/>
           <w:sz w:val="21"/>
         </w:rPr>
-        <w:t>Y tres medidas de ingeniería que el documento da por estimadas:</w:t>
+        <w:t>Y una comprobación que no es una constante sino una duda de fondo:</w:t>
       </w:r>
     </w:p>
     <w:tbl>
@@ -17111,7 +19065,7 @@
                 <w:color w:val="0B0B0B"/>
                 <w:sz w:val="18"/>
               </w:rPr>
-              <w:t>Medida</w:t>
+              <w:t>Comprobación</w:t>
             </w:r>
           </w:p>
         </w:tc>
@@ -17132,7 +19086,7 @@
                 <w:color w:val="0B0B0B"/>
                 <w:sz w:val="18"/>
               </w:rPr>
-              <w:t>Cómo se comprueba</w:t>
+              <w:t>Cómo se hace</w:t>
             </w:r>
           </w:p>
         </w:tc>
@@ -17149,12 +19103,12 @@
             <w:r/>
             <w:r>
               <w:rPr>
-                <w:b w:val="0"/>
-                <w:i w:val="0"/>
-                <w:color w:val="0B0B0B"/>
-                <w:sz w:val="18"/>
-              </w:rPr>
-              <w:t>Consumo real de cada tipo de nodo</w:t>
+                <w:b/>
+                <w:i w:val="0"/>
+                <w:color w:val="0B0B0B"/>
+                <w:sz w:val="18"/>
+              </w:rPr>
+              <w:t>Que los ultrasónicos midan hasta el suelo y no hasta el rastrojo</w:t>
             </w:r>
           </w:p>
         </w:tc>
@@ -17174,7 +19128,126 @@
                 <w:color w:val="0B0B0B"/>
                 <w:sz w:val="18"/>
               </w:rPr>
-              <w:t>Multímetro en serie, durante una hora de operación real</w:t>
+              <w:t xml:space="preserve">Prueba con cinta descrita en el manual de campo, §7.1. Un eco devuelto por las puntas del rastrojo da una altura plausible, estable y en rango, que el sistema marcaría como </w:t>
+            </w:r>
+            <w:r>
+              <w:rPr>
+                <w:rFonts w:ascii="Consolas" w:hAnsi="Consolas"/>
+                <w:b w:val="0"/>
+                <w:i w:val="0"/>
+                <w:color w:val="8B2E2E"/>
+                <w:sz w:val="16"/>
+              </w:rPr>
+              <w:t>buena</w:t>
+            </w:r>
+            <w:r>
+              <w:rPr>
+                <w:b w:val="0"/>
+                <w:i w:val="0"/>
+                <w:color w:val="0B0B0B"/>
+                <w:sz w:val="18"/>
+              </w:rPr>
+              <w:t xml:space="preserve">. </w:t>
+            </w:r>
+            <w:r>
+              <w:rPr>
+                <w:b/>
+                <w:i w:val="0"/>
+                <w:color w:val="0B0B0B"/>
+                <w:sz w:val="18"/>
+              </w:rPr>
+              <w:t xml:space="preserve">Hasta que la prueba la valide, </w:t>
+            </w:r>
+            <w:r>
+              <w:rPr>
+                <w:rFonts w:ascii="Consolas" w:hAnsi="Consolas"/>
+                <w:b/>
+                <w:i w:val="0"/>
+                <w:color w:val="8B2E2E"/>
+                <w:sz w:val="16"/>
+              </w:rPr>
+              <w:t>header_height</w:t>
+            </w:r>
+            <w:r>
+              <w:rPr>
+                <w:b/>
+                <w:i w:val="0"/>
+                <w:color w:val="0B0B0B"/>
+                <w:sz w:val="18"/>
+              </w:rPr>
+              <w:t xml:space="preserve"> no se publica</w:t>
+            </w:r>
+          </w:p>
+        </w:tc>
+      </w:tr>
+    </w:tbl>
+    <w:p>
+      <w:pPr>
+        <w:spacing w:after="80"/>
+      </w:pPr>
+    </w:p>
+    <w:p>
+      <w:r>
+        <w:rPr>
+          <w:b w:val="0"/>
+          <w:i w:val="0"/>
+          <w:color w:val="0B0B0B"/>
+          <w:sz w:val="21"/>
+        </w:rPr>
+        <w:t>Y ocho medidas de ingeniería que el documento da por estimadas:</w:t>
+      </w:r>
+    </w:p>
+    <w:tbl>
+      <w:tblPr>
+        <w:tblStyle w:val="TableGrid"/>
+        <w:tblW w:type="auto" w:w="0"/>
+        <w:jc w:val="center"/>
+        <w:tblLook w:firstColumn="1" w:firstRow="1" w:lastColumn="0" w:lastRow="0" w:noHBand="0" w:noVBand="1" w:val="04A0"/>
+      </w:tblPr>
+      <w:tblGrid>
+        <w:gridCol w:w="4819"/>
+        <w:gridCol w:w="4819"/>
+      </w:tblGrid>
+      <w:tr>
+        <w:tc>
+          <w:tcPr>
+            <w:tcW w:type="dxa" w:w="4819"/>
+            <w:shd w:val="clear" w:color="auto" w:fill="E8EDF6"/>
+          </w:tcPr>
+          <w:p>
+            <w:pPr>
+              <w:spacing w:after="40" w:before="40"/>
+            </w:pPr>
+            <w:r/>
+            <w:r>
+              <w:rPr>
+                <w:b/>
+                <w:i w:val="0"/>
+                <w:color w:val="0B0B0B"/>
+                <w:sz w:val="18"/>
+              </w:rPr>
+              <w:t>Medida</w:t>
+            </w:r>
+          </w:p>
+        </w:tc>
+        <w:tc>
+          <w:tcPr>
+            <w:tcW w:type="dxa" w:w="4819"/>
+            <w:shd w:val="clear" w:color="auto" w:fill="E8EDF6"/>
+          </w:tcPr>
+          <w:p>
+            <w:pPr>
+              <w:spacing w:after="40" w:before="40"/>
+            </w:pPr>
+            <w:r/>
+            <w:r>
+              <w:rPr>
+                <w:b/>
+                <w:i w:val="0"/>
+                <w:color w:val="0B0B0B"/>
+                <w:sz w:val="18"/>
+              </w:rPr>
+              <w:t>Cómo se comprueba</w:t>
             </w:r>
           </w:p>
         </w:tc>
@@ -17196,7 +19269,7 @@
                 <w:color w:val="0B0B0B"/>
                 <w:sz w:val="18"/>
               </w:rPr>
-              <w:t>Autonomía real del paquete</w:t>
+              <w:t>Consumo real de cada tipo de nodo</w:t>
             </w:r>
           </w:p>
         </w:tc>
@@ -17216,7 +19289,7 @@
                 <w:color w:val="0B0B0B"/>
                 <w:sz w:val="18"/>
               </w:rPr>
-              <w:t>Una jornada completa registrando la tensión del latido</w:t>
+              <w:t>Multímetro en serie, durante una hora de operación real</w:t>
             </w:r>
           </w:p>
         </w:tc>
@@ -17238,6 +19311,48 @@
                 <w:color w:val="0B0B0B"/>
                 <w:sz w:val="18"/>
               </w:rPr>
+              <w:t>Autonomía real del paquete</w:t>
+            </w:r>
+          </w:p>
+        </w:tc>
+        <w:tc>
+          <w:tcPr>
+            <w:tcW w:type="dxa" w:w="4819"/>
+          </w:tcPr>
+          <w:p>
+            <w:pPr>
+              <w:spacing w:after="40" w:before="40"/>
+            </w:pPr>
+            <w:r/>
+            <w:r>
+              <w:rPr>
+                <w:b w:val="0"/>
+                <w:i w:val="0"/>
+                <w:color w:val="0B0B0B"/>
+                <w:sz w:val="18"/>
+              </w:rPr>
+              <w:t>Una jornada completa registrando la tensión del latido</w:t>
+            </w:r>
+          </w:p>
+        </w:tc>
+      </w:tr>
+      <w:tr>
+        <w:tc>
+          <w:tcPr>
+            <w:tcW w:type="dxa" w:w="4819"/>
+          </w:tcPr>
+          <w:p>
+            <w:pPr>
+              <w:spacing w:after="40" w:before="40"/>
+            </w:pPr>
+            <w:r/>
+            <w:r>
+              <w:rPr>
+                <w:b w:val="0"/>
+                <w:i w:val="0"/>
+                <w:color w:val="0B0B0B"/>
+                <w:sz w:val="18"/>
+              </w:rPr>
               <w:t>Temperatura de la Pi bajo carga</w:t>
             </w:r>
           </w:p>
@@ -17259,6 +19374,234 @@
                 <w:sz w:val="18"/>
               </w:rPr>
               <w:t>Ocho horas al 70 % de CPU en la caja definitiva</w:t>
+            </w:r>
+          </w:p>
+        </w:tc>
+      </w:tr>
+      <w:tr>
+        <w:tc>
+          <w:tcPr>
+            <w:tcW w:type="dxa" w:w="4819"/>
+          </w:tcPr>
+          <w:p>
+            <w:pPr>
+              <w:spacing w:after="40" w:before="40"/>
+            </w:pPr>
+            <w:r/>
+            <w:r>
+              <w:rPr>
+                <w:b/>
+                <w:i w:val="0"/>
+                <w:color w:val="0B0B0B"/>
+                <w:sz w:val="18"/>
+              </w:rPr>
+              <w:t>Potencia y ventana del LED de la tolva</w:t>
+            </w:r>
+          </w:p>
+        </w:tc>
+        <w:tc>
+          <w:tcPr>
+            <w:tcW w:type="dxa" w:w="4819"/>
+          </w:tcPr>
+          <w:p>
+            <w:pPr>
+              <w:spacing w:after="40" w:before="40"/>
+            </w:pPr>
+            <w:r/>
+            <w:r>
+              <w:rPr>
+                <w:b w:val="0"/>
+                <w:i w:val="0"/>
+                <w:color w:val="0B0B0B"/>
+                <w:sz w:val="18"/>
+              </w:rPr>
+              <w:t xml:space="preserve">Banco, con la cámara, la distancia real y la exposición manual: la foto debe salir bien expuesta y </w:t>
+            </w:r>
+            <w:r>
+              <w:rPr>
+                <w:b/>
+                <w:i w:val="0"/>
+                <w:color w:val="0B0B0B"/>
+                <w:sz w:val="18"/>
+              </w:rPr>
+              <w:t>todas</w:t>
+            </w:r>
+            <w:r>
+              <w:rPr>
+                <w:b w:val="0"/>
+                <w:i w:val="0"/>
+                <w:color w:val="0B0B0B"/>
+                <w:sz w:val="18"/>
+              </w:rPr>
+              <w:t xml:space="preserve"> las guardadas, iluminadas</w:t>
+            </w:r>
+          </w:p>
+        </w:tc>
+      </w:tr>
+      <w:tr>
+        <w:tc>
+          <w:tcPr>
+            <w:tcW w:type="dxa" w:w="4819"/>
+          </w:tcPr>
+          <w:p>
+            <w:pPr>
+              <w:spacing w:after="40" w:before="40"/>
+            </w:pPr>
+            <w:r/>
+            <w:r>
+              <w:rPr>
+                <w:b/>
+                <w:i w:val="0"/>
+                <w:color w:val="0B0B0B"/>
+                <w:sz w:val="18"/>
+              </w:rPr>
+              <w:t>Consumo real de la Pi y autonomía de la batería de cabina</w:t>
+            </w:r>
+          </w:p>
+        </w:tc>
+        <w:tc>
+          <w:tcPr>
+            <w:tcW w:type="dxa" w:w="4819"/>
+          </w:tcPr>
+          <w:p>
+            <w:pPr>
+              <w:spacing w:after="40" w:before="40"/>
+            </w:pPr>
+            <w:r/>
+            <w:r>
+              <w:rPr>
+                <w:b w:val="0"/>
+                <w:i w:val="0"/>
+                <w:color w:val="0B0B0B"/>
+                <w:sz w:val="18"/>
+              </w:rPr>
+              <w:t>Una jornada completa en fase de dataset, midiendo la tensión de la batería</w:t>
+            </w:r>
+          </w:p>
+        </w:tc>
+      </w:tr>
+      <w:tr>
+        <w:tc>
+          <w:tcPr>
+            <w:tcW w:type="dxa" w:w="4819"/>
+          </w:tcPr>
+          <w:p>
+            <w:pPr>
+              <w:spacing w:after="40" w:before="40"/>
+            </w:pPr>
+            <w:r/>
+            <w:r>
+              <w:rPr>
+                <w:b/>
+                <w:i w:val="0"/>
+                <w:color w:val="0B0B0B"/>
+                <w:sz w:val="18"/>
+              </w:rPr>
+              <w:t>Capacidad real de las pilas AA</w:t>
+            </w:r>
+          </w:p>
+        </w:tc>
+        <w:tc>
+          <w:tcPr>
+            <w:tcW w:type="dxa" w:w="4819"/>
+          </w:tcPr>
+          <w:p>
+            <w:pPr>
+              <w:spacing w:after="40" w:before="40"/>
+            </w:pPr>
+            <w:r/>
+            <w:r>
+              <w:rPr>
+                <w:b w:val="0"/>
+                <w:i w:val="0"/>
+                <w:color w:val="0B0B0B"/>
+                <w:sz w:val="18"/>
+              </w:rPr>
+              <w:t>Descarga completa de un juego: la caja dice 3600 mAh y el cálculo usa 2600</w:t>
+            </w:r>
+          </w:p>
+        </w:tc>
+      </w:tr>
+      <w:tr>
+        <w:tc>
+          <w:tcPr>
+            <w:tcW w:type="dxa" w:w="4819"/>
+          </w:tcPr>
+          <w:p>
+            <w:pPr>
+              <w:spacing w:after="40" w:before="40"/>
+            </w:pPr>
+            <w:r/>
+            <w:r>
+              <w:rPr>
+                <w:b/>
+                <w:i w:val="0"/>
+                <w:color w:val="0B0B0B"/>
+                <w:sz w:val="18"/>
+              </w:rPr>
+              <w:t>Luz y autonomía del LED a 9 V</w:t>
+            </w:r>
+          </w:p>
+        </w:tc>
+        <w:tc>
+          <w:tcPr>
+            <w:tcW w:type="dxa" w:w="4819"/>
+          </w:tcPr>
+          <w:p>
+            <w:pPr>
+              <w:spacing w:after="40" w:before="40"/>
+            </w:pPr>
+            <w:r/>
+            <w:r>
+              <w:rPr>
+                <w:b w:val="0"/>
+                <w:i w:val="0"/>
+                <w:color w:val="0B0B0B"/>
+                <w:sz w:val="18"/>
+              </w:rPr>
+              <w:t>Banco: exposición de la foto con la batería llena y casi vacía</w:t>
+            </w:r>
+          </w:p>
+        </w:tc>
+      </w:tr>
+      <w:tr>
+        <w:tc>
+          <w:tcPr>
+            <w:tcW w:type="dxa" w:w="4819"/>
+          </w:tcPr>
+          <w:p>
+            <w:pPr>
+              <w:spacing w:after="40" w:before="40"/>
+            </w:pPr>
+            <w:r/>
+            <w:r>
+              <w:rPr>
+                <w:b/>
+                <w:i w:val="0"/>
+                <w:color w:val="0B0B0B"/>
+                <w:sz w:val="18"/>
+              </w:rPr>
+              <w:t>Zona ciega y tensión del RCWL-1655</w:t>
+            </w:r>
+          </w:p>
+        </w:tc>
+        <w:tc>
+          <w:tcPr>
+            <w:tcW w:type="dxa" w:w="4819"/>
+          </w:tcPr>
+          <w:p>
+            <w:pPr>
+              <w:spacing w:after="40" w:before="40"/>
+            </w:pPr>
+            <w:r/>
+            <w:r>
+              <w:rPr>
+                <w:b w:val="0"/>
+                <w:i w:val="0"/>
+                <w:color w:val="0B0B0B"/>
+                <w:sz w:val="18"/>
+              </w:rPr>
+              <w:t>Banco, con cinta: no hay hoja de datos oficial</w:t>
             </w:r>
           </w:p>
         </w:tc>
@@ -17277,7 +19620,7 @@
           <w:color w:val="0B0B0B"/>
           <w:sz w:val="21"/>
         </w:rPr>
-        <w:t>Hasta que esas tres estén medidas, la autonomía de 17 horas de la sección 3.2 es un cálculo, no un hecho.</w:t>
+        <w:t>Hasta que esas medidas estén hechas, las 11 horas de las cámaras (§3.2) y las 12 de la central (§3.5) son cálculos, no hechos.</w:t>
       </w:r>
     </w:p>
     <w:p>
@@ -17378,7 +19721,7 @@
                 <w:color w:val="0B0B0B"/>
                 <w:sz w:val="18"/>
               </w:rPr>
-              <w:t>Un ESP32-S3 por sensor y por cámara</w:t>
+              <w:t>Un ESP32 por sensor y por cámara (S3 en cámaras, C6 en sensores)</w:t>
             </w:r>
           </w:p>
         </w:tc>
@@ -17415,12 +19758,12 @@
             <w:r/>
             <w:r>
               <w:rPr>
-                <w:b w:val="0"/>
-                <w:i w:val="0"/>
-                <w:color w:val="0B0B0B"/>
-                <w:sz w:val="18"/>
-              </w:rPr>
-              <w:t>Batería propia por nodo</w:t>
+                <w:b/>
+                <w:i w:val="0"/>
+                <w:color w:val="0B0B0B"/>
+                <w:sz w:val="18"/>
+              </w:rPr>
+              <w:t>Nada conectado a la máquina</w:t>
             </w:r>
           </w:p>
         </w:tc>
@@ -17440,7 +19783,7 @@
                 <w:color w:val="0B0B0B"/>
                 <w:sz w:val="18"/>
               </w:rPr>
-              <w:t>Un fallo eléctrico de la máquina no apaga los ocho</w:t>
+              <w:t>No hay que intervenir el cableado de una cosechadora ajena, ni pedir permiso para hacerlo</w:t>
             </w:r>
           </w:p>
         </w:tc>
@@ -17462,7 +19805,7 @@
                 <w:color w:val="0B0B0B"/>
                 <w:sz w:val="18"/>
               </w:rPr>
-              <w:t>Dos celdas 18650 en paralelo</w:t>
+              <w:t>Batería propia por nodo</w:t>
             </w:r>
           </w:p>
         </w:tc>
@@ -17482,7 +19825,7 @@
                 <w:color w:val="0B0B0B"/>
                 <w:sz w:val="18"/>
               </w:rPr>
-              <w:t>Una sola no da margen para una jornada larga</w:t>
+              <w:t>Un fallo eléctrico de la máquina no apaga los ocho</w:t>
             </w:r>
           </w:p>
         </w:tc>
@@ -17504,7 +19847,7 @@
                 <w:color w:val="0B0B0B"/>
                 <w:sz w:val="18"/>
               </w:rPr>
-              <w:t>Ahorro de radio solo en sensores</w:t>
+              <w:t>4 AA Ni-MH directo al pin de 5 V</w:t>
             </w:r>
           </w:p>
         </w:tc>
@@ -17524,7 +19867,7 @@
                 <w:color w:val="0B0B0B"/>
                 <w:sz w:val="18"/>
               </w:rPr>
-              <w:t>Las cámaras pagan latencia; los sensores no, porque el instante viaja en la muestra</w:t>
+              <w:t>Pilas comunes y carga sencilla, sin elevador ni protección; a cambio, ≈ 11 h en las cámaras</w:t>
             </w:r>
           </w:p>
         </w:tc>
@@ -17541,12 +19884,12 @@
             <w:r/>
             <w:r>
               <w:rPr>
-                <w:b w:val="0"/>
-                <w:i w:val="0"/>
-                <w:color w:val="0B0B0B"/>
-                <w:sz w:val="18"/>
-              </w:rPr>
-              <w:t>Central en cabina, AP fuera</w:t>
+                <w:b/>
+                <w:i w:val="0"/>
+                <w:color w:val="0B0B0B"/>
+                <w:sz w:val="18"/>
+              </w:rPr>
+              <w:t>LiFePO4 de 12 V para la central</w:t>
             </w:r>
           </w:p>
         </w:tc>
@@ -17566,7 +19909,7 @@
                 <w:color w:val="0B0B0B"/>
                 <w:sz w:val="18"/>
               </w:rPr>
-              <w:t>La Pi quiere estar fresca, la antena cerca de los nodos</w:t>
+              <w:t>Una sola pieza de ≈ 150 Wh, tolerante al calor; desde 12 V la Pi y el router toman ≈ 1 A</w:t>
             </w:r>
           </w:p>
         </w:tc>
@@ -17583,12 +19926,12 @@
             <w:r/>
             <w:r>
               <w:rPr>
-                <w:b w:val="0"/>
-                <w:i w:val="0"/>
-                <w:color w:val="0B0B0B"/>
-                <w:sz w:val="18"/>
-              </w:rPr>
-              <w:t>Router dedicado y no celular</w:t>
+                <w:b/>
+                <w:i w:val="0"/>
+                <w:color w:val="0B0B0B"/>
+                <w:sz w:val="18"/>
+              </w:rPr>
+              <w:t>LED de tolva pulsado, con batería propia de 9 V</w:t>
             </w:r>
           </w:p>
         </w:tc>
@@ -17608,7 +19951,26 @@
                 <w:color w:val="0B0B0B"/>
                 <w:sz w:val="18"/>
               </w:rPr>
-              <w:t>Un hotspot de iPhone no admite nueve estaciones</w:t>
+              <w:t xml:space="preserve">No toca las pilas de </w:t>
+            </w:r>
+            <w:r>
+              <w:rPr>
+                <w:rFonts w:ascii="Consolas" w:hAnsi="Consolas"/>
+                <w:b w:val="0"/>
+                <w:i w:val="0"/>
+                <w:color w:val="8B2E2E"/>
+                <w:sz w:val="16"/>
+              </w:rPr>
+              <w:t>CAM04</w:t>
+            </w:r>
+            <w:r>
+              <w:rPr>
+                <w:b w:val="0"/>
+                <w:i w:val="0"/>
+                <w:color w:val="0B0B0B"/>
+                <w:sz w:val="18"/>
+              </w:rPr>
+              <w:t>, y encenderlo solo durante la foto cuesta diez veces menos energía</w:t>
             </w:r>
           </w:p>
         </w:tc>
@@ -17630,6 +19992,132 @@
                 <w:color w:val="0B0B0B"/>
                 <w:sz w:val="18"/>
               </w:rPr>
+              <w:t>Ahorro de radio solo en sensores</w:t>
+            </w:r>
+          </w:p>
+        </w:tc>
+        <w:tc>
+          <w:tcPr>
+            <w:tcW w:type="dxa" w:w="4819"/>
+          </w:tcPr>
+          <w:p>
+            <w:pPr>
+              <w:spacing w:after="40" w:before="40"/>
+            </w:pPr>
+            <w:r/>
+            <w:r>
+              <w:rPr>
+                <w:b w:val="0"/>
+                <w:i w:val="0"/>
+                <w:color w:val="0B0B0B"/>
+                <w:sz w:val="18"/>
+              </w:rPr>
+              <w:t>Las cámaras pagan latencia; los sensores no, porque el instante viaja en la muestra</w:t>
+            </w:r>
+          </w:p>
+        </w:tc>
+      </w:tr>
+      <w:tr>
+        <w:tc>
+          <w:tcPr>
+            <w:tcW w:type="dxa" w:w="4819"/>
+          </w:tcPr>
+          <w:p>
+            <w:pPr>
+              <w:spacing w:after="40" w:before="40"/>
+            </w:pPr>
+            <w:r/>
+            <w:r>
+              <w:rPr>
+                <w:b w:val="0"/>
+                <w:i w:val="0"/>
+                <w:color w:val="0B0B0B"/>
+                <w:sz w:val="18"/>
+              </w:rPr>
+              <w:t>Central en cabina, AP fuera</w:t>
+            </w:r>
+          </w:p>
+        </w:tc>
+        <w:tc>
+          <w:tcPr>
+            <w:tcW w:type="dxa" w:w="4819"/>
+          </w:tcPr>
+          <w:p>
+            <w:pPr>
+              <w:spacing w:after="40" w:before="40"/>
+            </w:pPr>
+            <w:r/>
+            <w:r>
+              <w:rPr>
+                <w:b w:val="0"/>
+                <w:i w:val="0"/>
+                <w:color w:val="0B0B0B"/>
+                <w:sz w:val="18"/>
+              </w:rPr>
+              <w:t>La Pi quiere estar fresca, la antena cerca de los nodos</w:t>
+            </w:r>
+          </w:p>
+        </w:tc>
+      </w:tr>
+      <w:tr>
+        <w:tc>
+          <w:tcPr>
+            <w:tcW w:type="dxa" w:w="4819"/>
+          </w:tcPr>
+          <w:p>
+            <w:pPr>
+              <w:spacing w:after="40" w:before="40"/>
+            </w:pPr>
+            <w:r/>
+            <w:r>
+              <w:rPr>
+                <w:b w:val="0"/>
+                <w:i w:val="0"/>
+                <w:color w:val="0B0B0B"/>
+                <w:sz w:val="18"/>
+              </w:rPr>
+              <w:t>Router dedicado (Tenda N301) y no celular</w:t>
+            </w:r>
+          </w:p>
+        </w:tc>
+        <w:tc>
+          <w:tcPr>
+            <w:tcW w:type="dxa" w:w="4819"/>
+          </w:tcPr>
+          <w:p>
+            <w:pPr>
+              <w:spacing w:after="40" w:before="40"/>
+            </w:pPr>
+            <w:r/>
+            <w:r>
+              <w:rPr>
+                <w:b w:val="0"/>
+                <w:i w:val="0"/>
+                <w:color w:val="0B0B0B"/>
+                <w:sz w:val="18"/>
+              </w:rPr>
+              <w:t>Un hotspot de iPhone no admite nueve estaciones</w:t>
+            </w:r>
+          </w:p>
+        </w:tc>
+      </w:tr>
+      <w:tr>
+        <w:tc>
+          <w:tcPr>
+            <w:tcW w:type="dxa" w:w="4819"/>
+          </w:tcPr>
+          <w:p>
+            <w:pPr>
+              <w:spacing w:after="40" w:before="40"/>
+            </w:pPr>
+            <w:r/>
+            <w:r>
+              <w:rPr>
+                <w:b w:val="0"/>
+                <w:i w:val="0"/>
+                <w:color w:val="0B0B0B"/>
+                <w:sz w:val="18"/>
+              </w:rPr>
               <w:t>SSD NVMe y no microSD</w:t>
             </w:r>
           </w:p>
@@ -17650,7 +20138,49 @@
                 <w:color w:val="0B0B0B"/>
                 <w:sz w:val="18"/>
               </w:rPr>
-              <w:t>17 GB por jornada, escritos a diario</w:t>
+              <w:t>15–17 GB por jornada, escritos a diario</w:t>
+            </w:r>
+          </w:p>
+        </w:tc>
+      </w:tr>
+      <w:tr>
+        <w:tc>
+          <w:tcPr>
+            <w:tcW w:type="dxa" w:w="4819"/>
+          </w:tcPr>
+          <w:p>
+            <w:pPr>
+              <w:spacing w:after="40" w:before="40"/>
+            </w:pPr>
+            <w:r/>
+            <w:r>
+              <w:rPr>
+                <w:b/>
+                <w:i w:val="0"/>
+                <w:color w:val="0B0B0B"/>
+                <w:sz w:val="18"/>
+              </w:rPr>
+              <w:t>Sin microSD en los nodos</w:t>
+            </w:r>
+          </w:p>
+        </w:tc>
+        <w:tc>
+          <w:tcPr>
+            <w:tcW w:type="dxa" w:w="4819"/>
+          </w:tcPr>
+          <w:p>
+            <w:pPr>
+              <w:spacing w:after="40" w:before="40"/>
+            </w:pPr>
+            <w:r/>
+            <w:r>
+              <w:rPr>
+                <w:b w:val="0"/>
+                <w:i w:val="0"/>
+                <w:color w:val="0B0B0B"/>
+                <w:sz w:val="18"/>
+              </w:rPr>
+              <w:t>Todo va al SSD de la Pi; a cambio, si la Pi o el Wi-Fi caen, los frames de ese intervalo se pierden</w:t>
             </w:r>
           </w:p>
         </w:tc>

</xml_diff>